<commit_message>
Improve notebook outputs and figure rendering
</commit_message>
<xml_diff>
--- a/Drafts/04-08-25 ABG_VBG_Rough Draft BL.docx
+++ b/Drafts/04-08-25 ABG_VBG_Rough Draft BL.docx
@@ -175,58 +175,32 @@
       </w:r>
     </w:p>
     <w:p>
-      <w:pPr>
-        <w:spacing w:after="0"/>
-        <w:rPr>
-          <w:shd w:val="clear" w:color="auto" w:fill="FFFFFF"/>
-        </w:rPr>
-      </w:pPr>
-      <w:r>
-        <w:rPr>
-          <w:shd w:val="clear" w:color="auto" w:fill="FFFFFF"/>
-        </w:rPr>
+      <w:r>
         <w:t>American Thoracic Society ASPIRE Fellowship</w:t>
       </w:r>
-    </w:p>
-    <w:p>
-      <w:pPr>
-        <w:spacing w:after="0"/>
-        <w:rPr>
-          <w:shd w:val="clear" w:color="auto" w:fill="FFFFFF"/>
-        </w:rPr>
-      </w:pPr>
-      <w:r>
-        <w:rPr>
-          <w:shd w:val="clear" w:color="auto" w:fill="FFFFFF"/>
-        </w:rPr>
-        <w:t>Intermountain Fund Early Career PCCM Seed Grant</w:t>
-      </w:r>
-    </w:p>
-    <w:p>
-      <w:pPr>
-        <w:spacing w:after="0"/>
-        <w:rPr>
-          <w:shd w:val="clear" w:color="auto" w:fill="FFFFFF"/>
-        </w:rPr>
-      </w:pPr>
-      <w:r>
-        <w:rPr>
-          <w:shd w:val="clear" w:color="auto" w:fill="FFFFFF"/>
-        </w:rPr>
-        <w:t>[ ] Ithan’s Grants</w:t>
-      </w:r>
-    </w:p>
-    <w:p>
-      <w:pPr>
-        <w:rPr>
-          <w:shd w:val="clear" w:color="auto" w:fill="FFFFFF"/>
-        </w:rPr>
-      </w:pPr>
-      <w:r>
-        <w:rPr>
-          <w:shd w:val="clear" w:color="auto" w:fill="FFFFFF"/>
-        </w:rPr>
-        <w:t>[ ] Ram / CTSI grants</w:t>
+      <w:r>
+        <w:t xml:space="preserve"> (B.W.L.)</w:t>
+      </w:r>
+    </w:p>
+    <w:p>
+      <w:r>
+        <w:t xml:space="preserve">Intermountain Fund </w:t>
+      </w:r>
+      <w:r>
+        <w:t>(B.W.L)</w:t>
+      </w:r>
+    </w:p>
+    <w:p>
+      <w:r>
+        <w:t>National Institute of General Medical Sciences R35GM151147 (I.D.P.)</w:t>
+      </w:r>
+    </w:p>
+    <w:p>
+      <w:r>
+        <w:t xml:space="preserve">National Center for Advancing Translational Sciences UL1TR002538 and UM1TR004409 </w:t>
+      </w:r>
+      <w:r>
+        <w:t>(R.G.)</w:t>
       </w:r>
     </w:p>
     <w:p>
@@ -357,7 +331,15 @@
             <w:u w:val="none"/>
             <w:shd w:val="clear" w:color="auto" w:fill="FFFFFF"/>
           </w:rPr>
-          <w:t>github.com/reblocke/abg-vbg-project</w:t>
+          <w:t>g</w:t>
+        </w:r>
+        <w:r>
+          <w:rPr>
+            <w:rStyle w:val="Hyperlink"/>
+            <w:u w:val="none"/>
+            <w:shd w:val="clear" w:color="auto" w:fill="FFFFFF"/>
+          </w:rPr>
+          <w:t>ithub.com/reblocke/abg-vbg-project</w:t>
         </w:r>
       </w:hyperlink>
       <w:r>
@@ -398,7 +380,6 @@
           <w:shd w:val="clear" w:color="auto" w:fill="FFFFFF"/>
         </w:rPr>
       </w:pPr>
-      <w:commentRangeStart w:id="0"/>
       <w:r>
         <w:rPr>
           <w:rFonts w:eastAsia="Times New Roman"/>
@@ -407,504 +388,292 @@
         <w:lastRenderedPageBreak/>
         <w:t>Abstract:</w:t>
       </w:r>
+    </w:p>
+    <w:p>
+      <w:pPr>
+        <w:pStyle w:val="Subtitle"/>
+        <w:rPr>
+          <w:rFonts w:eastAsia="Times New Roman"/>
+          <w:shd w:val="clear" w:color="auto" w:fill="FFFFFF"/>
+        </w:rPr>
+      </w:pPr>
+      <w:r>
+        <w:rPr>
+          <w:rFonts w:eastAsia="Times New Roman"/>
+          <w:shd w:val="clear" w:color="auto" w:fill="FFFFFF"/>
+        </w:rPr>
+        <w:t>Background:</w:t>
+      </w:r>
+    </w:p>
+    <w:p>
+      <w:r>
+        <w:t>Arterial blood gases (ABGs) are the reference standard for assessing hypercapnia but are invasive and difficult to obtain. Venous blood gases (VBGs) are more accessible and easier to integrate into routine care, yet many diagnosis and treatment pathways still depend on arterial confirmation. We compared whether arterial and venous pCO₂ showed similar associations with hypercapnic respiratory failure diagnosis, ventilatory support, and 60-day mortality after accounting for the likelihood of each test being ordered.</w:t>
+      </w:r>
+    </w:p>
+    <w:p>
+      <w:pPr>
+        <w:pStyle w:val="Subtitle"/>
+      </w:pPr>
+      <w:r>
+        <w:t>Methods:</w:t>
+      </w:r>
+    </w:p>
+    <w:p>
+      <w:r>
+        <w:t>We conducted a multicenter retrospective encounter-level cohort study in the TriNetX research network among adults with emergency department or inpatient encounters during 2022 meeting a hypercapnia-suspicion phenotype. pCO₂ from ABG and VBG was analyzed using test-specific three-level categories and continuous spline models. To mitigate confounding from selective test ordering, we estimated inverse propensity-of-sampling weights from multivariable logistic models in multiply imputed data. Outcomes were encounter-level hypercapnic respiratory failure diagnosis, non-invasive ventilation, invasive mechanical ventilation, and 60-day all-cause mortality.</w:t>
+      </w:r>
+    </w:p>
+    <w:p>
+      <w:pPr>
+        <w:pStyle w:val="Subtitle"/>
+        <w:rPr>
+          <w:rFonts w:eastAsia="Times New Roman"/>
+          <w:shd w:val="clear" w:color="auto" w:fill="FFFFFF"/>
+        </w:rPr>
+      </w:pPr>
+      <w:r>
+        <w:rPr>
+          <w:rFonts w:eastAsia="Times New Roman"/>
+          <w:shd w:val="clear" w:color="auto" w:fill="FFFFFF"/>
+        </w:rPr>
+        <w:t>Results:</w:t>
+      </w:r>
+    </w:p>
+    <w:p>
+      <w:r>
+        <w:t>After inverse propensity weighting, venous and arterial pCO₂ showed broadly similar prognostic associations across all four outcomes. The analytic cohort included 515,286 encounters across 107 health systems; 187,242 had any ABG testing and 149,663 had any VBG testing. For high vs normal pCO₂, the paired ABG and VBG odds ratios were 1.33 (95% CI, 1.29-1.37) and 1.54 (1.48-1.61) for invasive mechanical ventilation, 2.64 (2.53-2.75) and 2.93 (2.77-3.10) for non-invasive ventilation, 1.40 (1.35-1.45) and 1.42 (1.35-1.48) for 60-day mortality, and 6.23 (5.97-6.50) and 8.00 (7.55-8.47) for hypercapnic respiratory failure diagnosis. Low pCO₂ showed little association with non-invasive ventilation or hypercapnic respiratory failure diagnosis for either modality, but was associated with invasive mechanical ventilation and mortality.</w:t>
+      </w:r>
+    </w:p>
+    <w:p>
+      <w:pPr>
+        <w:pStyle w:val="Subtitle"/>
+        <w:rPr>
+          <w:rFonts w:eastAsia="Times New Roman"/>
+          <w:shd w:val="clear" w:color="auto" w:fill="FFFFFF"/>
+        </w:rPr>
+      </w:pPr>
+      <w:r>
+        <w:rPr>
+          <w:rFonts w:eastAsia="Times New Roman"/>
+          <w:shd w:val="clear" w:color="auto" w:fill="FFFFFF"/>
+        </w:rPr>
+        <w:t>Conclusions:</w:t>
+      </w:r>
+    </w:p>
+    <w:p>
+      <w:r>
+        <w:t>In this multicenter encounter-level cohort, venous and arterial pCO₂ showed broadly similar associations with ventilatory support, coded hypercapnic respiratory failure, and 60-day mortality after accounting for differential test ordering. These findings are consistent with venous-based assessment as a plausible patient-centered approach in some settings where arterial confirmation is difficult or burdensome.</w:t>
+      </w:r>
+      <w:r>
+        <w:br w:type="page"/>
+      </w:r>
+    </w:p>
+    <w:p>
+      <w:pPr>
+        <w:pStyle w:val="Title"/>
+      </w:pPr>
+      <w:commentRangeStart w:id="0"/>
+      <w:r>
+        <w:rPr>
+          <w:rStyle w:val="s1"/>
+        </w:rPr>
+        <w:lastRenderedPageBreak/>
+        <w:t>Introduction:</w:t>
+      </w:r>
+      <w:r>
+        <w:rPr>
+          <w:rStyle w:val="apple-converted-space"/>
+        </w:rPr>
+        <w:t> </w:t>
+      </w:r>
       <w:commentRangeEnd w:id="0"/>
       <w:r>
         <w:rPr>
           <w:rStyle w:val="CommentReference"/>
-          <w:rFonts w:eastAsia="Times New Roman"/>
           <w:sz w:val="24"/>
           <w:szCs w:val="22"/>
-          <w:shd w:val="clear" w:color="auto" w:fill="FFFFFF"/>
         </w:rPr>
         <w:commentReference w:id="0"/>
       </w:r>
     </w:p>
     <w:p>
       <w:pPr>
-        <w:pStyle w:val="Subtitle"/>
-        <w:rPr>
-          <w:rFonts w:eastAsia="Times New Roman"/>
-          <w:shd w:val="clear" w:color="auto" w:fill="FFFFFF"/>
-        </w:rPr>
-      </w:pPr>
-      <w:r>
-        <w:rPr>
-          <w:rFonts w:eastAsia="Times New Roman"/>
-          <w:shd w:val="clear" w:color="auto" w:fill="FFFFFF"/>
-        </w:rPr>
-        <w:t>Background:</w:t>
-      </w:r>
-    </w:p>
-    <w:p>
-      <w:pPr>
-        <w:rPr>
-          <w:shd w:val="clear" w:color="auto" w:fill="FFFFFF"/>
-        </w:rPr>
-      </w:pPr>
-      <w:r>
-        <w:t xml:space="preserve">Arterial blood gases (ABGs) </w:t>
-      </w:r>
-      <w:r>
-        <w:t xml:space="preserve">are </w:t>
-      </w:r>
-      <w:r>
-        <w:t>the reference</w:t>
-      </w:r>
-      <w:r>
-        <w:t xml:space="preserve"> standard</w:t>
-      </w:r>
-      <w:r>
-        <w:t xml:space="preserve"> test for hypercapnia but are invasive and difficult to obtain. Venous blood gases (VBGs) are more</w:t>
-      </w:r>
-      <w:r>
-        <w:t xml:space="preserve"> convenient and</w:t>
-      </w:r>
-      <w:r>
-        <w:t xml:space="preserve"> accessible, yet </w:t>
-      </w:r>
-      <w:r>
-        <w:t xml:space="preserve">current </w:t>
-      </w:r>
-      <w:r>
-        <w:t>diagnostic and device qualification criteria typically exclude VBG evidence</w:t>
-      </w:r>
-      <w:r>
-        <w:t xml:space="preserve"> of hypercapnia</w:t>
-      </w:r>
-      <w:r>
-        <w:t xml:space="preserve">. </w:t>
-      </w:r>
-      <w:r>
-        <w:t>To address this gap, we compared prognostic associations of hypercapnia measured by ABG and VBG with ventilator support and 60-day mortality,</w:t>
-      </w:r>
-      <w:r>
-        <w:t xml:space="preserve"> after</w:t>
-      </w:r>
-      <w:r>
-        <w:t xml:space="preserve"> adjusting for the likelihood of each test being ordered.</w:t>
-      </w:r>
-    </w:p>
-    <w:p>
-      <w:pPr>
-        <w:pStyle w:val="Subtitle"/>
-        <w:rPr>
-          <w:rFonts w:eastAsia="Times New Roman"/>
-          <w:shd w:val="clear" w:color="auto" w:fill="FFFFFF"/>
-        </w:rPr>
-      </w:pPr>
-      <w:r>
-        <w:rPr>
-          <w:rFonts w:eastAsia="Times New Roman"/>
-          <w:shd w:val="clear" w:color="auto" w:fill="FFFFFF"/>
-        </w:rPr>
-        <w:t>Methods:</w:t>
-      </w:r>
-    </w:p>
-    <w:p>
-      <w:pPr>
-        <w:rPr>
-          <w:shd w:val="clear" w:color="auto" w:fill="FFFFFF"/>
-        </w:rPr>
-      </w:pPr>
-      <w:r>
-        <w:t>We conducted a multicenter retrospective study using the TriNetX research network, including adult patients presenting to the Emergency Department (ED) or admitted to the hospital during 2022 with a presentation indicating possible hypercapnia (at least 1 factor that should trigger consideration). The exposure was pCO</w:t>
-      </w:r>
-      <w:r>
-        <w:rPr>
-          <w:vertAlign w:val="subscript"/>
-        </w:rPr>
-        <w:t>2</w:t>
-      </w:r>
-      <w:r>
-        <w:t xml:space="preserve"> measured by ABG (hypercapnia ≥ 45 mmHg; hypocapnia &lt; 35 mmHg) and VBG (hypercapnia ≥ 50 mmHg; hypocapnia &lt; 40 mmHg). To mitigate confounding by test selection,</w:t>
-      </w:r>
-      <w:r>
-        <w:t xml:space="preserve"> we used </w:t>
-      </w:r>
-      <w:r>
-        <w:t>multivariable logistic regression</w:t>
-      </w:r>
-      <w:r>
-        <w:t>s</w:t>
-      </w:r>
-      <w:r>
-        <w:t xml:space="preserve"> </w:t>
-      </w:r>
-      <w:r>
-        <w:t xml:space="preserve">on multiply imputed data using </w:t>
-      </w:r>
-      <w:r>
-        <w:t xml:space="preserve">encounter-type, demographics, comorbidities, vital signs, and labs to derive inverse propensity-of-sampling weights. Outcomes were within-encounter diagnosis code for hypercapnic respiratory failure, within-encounter procedure codes for </w:t>
-      </w:r>
-      <w:r>
-        <w:t>non-invasive</w:t>
-      </w:r>
-      <w:r>
-        <w:t xml:space="preserve"> ventilation (NIV) or invasive mechanical ventilation (IMV), and 60-day all-cause mortality. </w:t>
-      </w:r>
-      <w:r>
-        <w:t>Inverse-propensity weighted a</w:t>
-      </w:r>
-      <w:r>
-        <w:t xml:space="preserve">ssociations </w:t>
-      </w:r>
-      <w:r>
-        <w:t xml:space="preserve">were </w:t>
-      </w:r>
-      <w:r>
-        <w:t>estimating</w:t>
-      </w:r>
-      <w:r>
-        <w:t xml:space="preserve"> </w:t>
-      </w:r>
-      <w:r>
-        <w:t xml:space="preserve">using logistic regression with </w:t>
-      </w:r>
-      <w:r>
-        <w:t xml:space="preserve">pCO₂ </w:t>
-      </w:r>
-      <w:r>
-        <w:t>modeled both categorically and continuously using restricted cubic splines.</w:t>
-      </w:r>
-      <w:r>
-        <w:t xml:space="preserve">  Rates of NIV and hypercapnia diagnosis amongst patients with hypocapnia were used as negative controls.</w:t>
-      </w:r>
-    </w:p>
-    <w:p>
-      <w:pPr>
-        <w:pStyle w:val="Subtitle"/>
-        <w:rPr>
-          <w:rFonts w:eastAsia="Times New Roman"/>
-          <w:shd w:val="clear" w:color="auto" w:fill="FFFFFF"/>
-        </w:rPr>
-      </w:pPr>
-      <w:r>
-        <w:rPr>
-          <w:rFonts w:eastAsia="Times New Roman"/>
-          <w:shd w:val="clear" w:color="auto" w:fill="FFFFFF"/>
-        </w:rPr>
-        <w:t>Results:</w:t>
-      </w:r>
-    </w:p>
-    <w:p>
-      <w:pPr>
-        <w:rPr>
-          <w:shd w:val="clear" w:color="auto" w:fill="FFFFFF"/>
-        </w:rPr>
-      </w:pPr>
-      <w:r>
-        <w:t>We identified 515,286 patient</w:t>
-      </w:r>
-      <w:r>
-        <w:t xml:space="preserve"> encounters</w:t>
-      </w:r>
-      <w:r>
-        <w:t xml:space="preserve"> across 107 health systems</w:t>
-      </w:r>
-      <w:r>
-        <w:t>.</w:t>
-      </w:r>
-      <w:r>
-        <w:t xml:space="preserve"> 187,242 had a first calendar-day ABG and 149,663 had a VBG. Before weighting, ABGs were more commonly obtained in inpatient setting (85% inpatient, 15% ED) compared with VBG (68% inpatient, 32% ED). </w:t>
-      </w:r>
-      <w:r>
-        <w:t xml:space="preserve">After </w:t>
-      </w:r>
-      <w:r>
-        <w:t>propensity weighting</w:t>
-      </w:r>
-      <w:r>
-        <w:t xml:space="preserve">, hypercapnia identified by both modalities showed similar associations </w:t>
-      </w:r>
-      <w:r>
-        <w:t xml:space="preserve">with outcomes. </w:t>
-      </w:r>
-      <w:r>
-        <w:t xml:space="preserve">Adjusted odds ratios </w:t>
-      </w:r>
-      <w:r>
-        <w:t>for hypercapnia</w:t>
-      </w:r>
-      <w:r>
-        <w:t xml:space="preserve"> (as compared to normocapnia)</w:t>
-      </w:r>
-      <w:r>
-        <w:t xml:space="preserve"> were 1.33 vs 1.54 for IMV, 2.64 vs 2.93 NIV, 1.40 vs 1.42 for mortality and 6.23 vs 8.00 for hypercapnic respiratory failure diagnosis.</w:t>
-      </w:r>
-      <w:r>
-        <w:t xml:space="preserve"> The weighted rates of</w:t>
-      </w:r>
-      <w:r>
-        <w:t xml:space="preserve"> hypercapnia diagnosis and NIV receipt were roughly null,</w:t>
-      </w:r>
-      <w:r>
-        <w:t xml:space="preserve"> supporting adequate control of sampling by inverse-propensity weighting. </w:t>
-      </w:r>
-      <w:r>
-        <w:t xml:space="preserve">Both hypocapnia and hypercapnia by either type of blood gas were associated with similar increased rates of IMV and 60-d all-cause mortality, as compared to </w:t>
-      </w:r>
-      <w:r>
-        <w:t>hypercapnia.</w:t>
-      </w:r>
-    </w:p>
-    <w:p>
-      <w:pPr>
-        <w:pStyle w:val="Subtitle"/>
-        <w:rPr>
-          <w:rFonts w:eastAsia="Times New Roman"/>
-          <w:shd w:val="clear" w:color="auto" w:fill="FFFFFF"/>
-        </w:rPr>
-      </w:pPr>
-      <w:r>
-        <w:rPr>
-          <w:rFonts w:eastAsia="Times New Roman"/>
-          <w:shd w:val="clear" w:color="auto" w:fill="FFFFFF"/>
-        </w:rPr>
-        <w:t>Conclusions:</w:t>
-      </w:r>
-    </w:p>
-    <w:p>
-      <w:r>
-        <w:t>In this large, multicenter cohort, hypercapnia identified on VBG demonstrated</w:t>
-      </w:r>
-      <w:r>
-        <w:t xml:space="preserve"> similar</w:t>
-      </w:r>
-      <w:r>
-        <w:t xml:space="preserve"> prognostic associations for</w:t>
-      </w:r>
-      <w:r>
-        <w:t xml:space="preserve"> receipt</w:t>
-      </w:r>
-      <w:r>
-        <w:t xml:space="preserve"> ventilatory support and </w:t>
-      </w:r>
-      <w:r>
-        <w:t xml:space="preserve">death </w:t>
-      </w:r>
-      <w:r>
-        <w:t>after</w:t>
-      </w:r>
-      <w:r>
-        <w:t xml:space="preserve"> propensity</w:t>
-      </w:r>
-      <w:r>
-        <w:t xml:space="preserve"> weighting. VBG results were also similarly associated with subsequent diagnostic labeling, suggesting clinicians currently use VBGs to support the diagnosis, despite current formal criteria.  </w:t>
-      </w:r>
-      <w:r>
-        <w:t>As prognostic information contained in venous and arterial blood gas samples appear similar once differing test ordering is accounted for, b</w:t>
-      </w:r>
-      <w:r>
-        <w:t xml:space="preserve">roader acceptance of VBG-based definitions in billing and device qualification </w:t>
-      </w:r>
-      <w:r>
-        <w:t>criteria should</w:t>
-      </w:r>
-      <w:r>
-        <w:t xml:space="preserve"> be considered. </w:t>
-      </w:r>
-    </w:p>
-    <w:p>
-      <w:r>
-        <w:br w:type="page"/>
-      </w:r>
-    </w:p>
-    <w:p>
-      <w:pPr>
-        <w:pStyle w:val="Title"/>
-      </w:pPr>
+        <w:spacing w:after="240"/>
+      </w:pPr>
+      <w:r>
+        <w:t xml:space="preserve">Hypercapnic respiratory failure is associated with substantial symptoms, </w:t>
+      </w:r>
       <w:commentRangeStart w:id="1"/>
       <w:r>
-        <w:rPr>
-          <w:rStyle w:val="s1"/>
-        </w:rPr>
-        <w:lastRenderedPageBreak/>
-        <w:t>Introduction:</w:t>
-      </w:r>
-      <w:r>
-        <w:rPr>
-          <w:rStyle w:val="apple-converted-space"/>
-        </w:rPr>
-        <w:t> </w:t>
+        <w:t>healthcare use</w:t>
       </w:r>
       <w:commentRangeEnd w:id="1"/>
-      <w:r>
-        <w:rPr>
-          <w:rStyle w:val="CommentReference"/>
-          <w:sz w:val="24"/>
-          <w:szCs w:val="22"/>
-        </w:rPr>
-        <w:commentReference w:id="1"/>
-      </w:r>
-    </w:p>
-    <w:p>
-      <w:pPr>
-        <w:spacing w:after="240"/>
-      </w:pPr>
-      <w:r>
-        <w:t xml:space="preserve">Hypercapnic respiratory failure is associated with substantial </w:t>
-      </w:r>
-      <w:commentRangeStart w:id="2"/>
-      <w:r>
-        <w:t>symptoms</w:t>
-      </w:r>
-      <w:commentRangeEnd w:id="2"/>
       <w:r>
         <w:rPr>
           <w:rStyle w:val="CommentReference"/>
           <w:sz w:val="24"/>
           <w:szCs w:val="24"/>
         </w:rPr>
-        <w:commentReference w:id="2"/>
-      </w:r>
-      <w:r>
-        <w:t xml:space="preserve">, </w:t>
-      </w:r>
+        <w:commentReference w:id="1"/>
+      </w:r>
+      <w:r>
+        <w:t xml:space="preserve">, and </w:t>
+      </w:r>
+      <w:commentRangeStart w:id="2"/>
       <w:commentRangeStart w:id="3"/>
       <w:r>
-        <w:t>healthcare use</w:t>
-      </w:r>
-      <w:commentRangeEnd w:id="3"/>
+        <w:t>mortality ris</w:t>
+      </w:r>
+      <w:commentRangeEnd w:id="2"/>
       <w:r>
         <w:rPr>
           <w:rStyle w:val="CommentReference"/>
           <w:sz w:val="24"/>
           <w:szCs w:val="24"/>
         </w:rPr>
-        <w:commentReference w:id="3"/>
-      </w:r>
-      <w:r>
-        <w:t xml:space="preserve">, and </w:t>
-      </w:r>
-      <w:commentRangeStart w:id="4"/>
-      <w:commentRangeStart w:id="5"/>
-      <w:r>
-        <w:t>mortality ris</w:t>
-      </w:r>
-      <w:commentRangeEnd w:id="4"/>
+        <w:commentReference w:id="2"/>
+      </w:r>
+      <w:commentRangeEnd w:id="3"/>
       <w:r>
         <w:rPr>
           <w:rStyle w:val="CommentReference"/>
           <w:sz w:val="24"/>
           <w:szCs w:val="24"/>
         </w:rPr>
-        <w:commentReference w:id="4"/>
-      </w:r>
-      <w:commentRangeEnd w:id="5"/>
+        <w:commentReference w:id="3"/>
+      </w:r>
+      <w:r>
+        <w:t>k, but reliable recognition still nominally depends on arterial blood gas testing. Because arterial sampling is invasive, painful, and technically demanding</w:t>
+      </w:r>
+      <w:r>
+        <w:fldChar w:fldCharType="begin"/>
+      </w:r>
+      <w:r>
+        <w:instrText xml:space="preserve"> ADDIN ZOTERO_ITEM CSL_CITATION {"citationID":"ChvojsMO","properties":{"formattedCitation":"\\super 1\\nosupersub{}","plainCitation":"1","noteIndex":0},"citationItems":[{"id":6,"uris":["http://zotero.org/groups/6192411/items/CG6S42R4"],"itemData":{"id":6,"type":"article-journal","abstract":"Abstract Venous blood gases (VBGs) are safe and effective at screening for hypercarbic respiratory failure. Multiple studies have validated that a VBG with a PvCO2 less than 45 reliably rules out hypercarbia. The use of VBGs for the initial screening of hypercarbia when hypercarbic respiratory failure is suspected can reduce the overall use of arterial blood gases which are more painful and take more time and expertise to perform.","container-title":"Journal of Hospital Medicine","DOI":"10.1002/jhm.70039","ISSN":"1553-5592","issue":"9","journalAbbreviation":"Journal of Hospital Medicine","note":"PMID: 40183604\nPMCID: PMC12406756","page":"1002-1004","PMID":"40183604","PMCID":"PMC12406756","publisher":"John Wiley &amp; Sons, Ltd","title":"Things We Do for No Reason™: Arterial blood gas testing to screen for hypercarbic respiratory failure","volume":"20","author":[{"family":"Lacy","given":"Mary E."},{"family":"Saa","given":"Lisa"},{"family":"Bruss","given":"Zachary"},{"family":"Noronha","given":"Leonard"}],"issued":{"date-parts":[["2025",9,1]]}}}],"schema":"https://github.com/citation-style-language/schema/raw/master/csl-citation.json"} </w:instrText>
+      </w:r>
+      <w:r>
+        <w:fldChar w:fldCharType="separate"/>
+      </w:r>
+      <w:r>
+        <w:rPr>
+          <w:vertAlign w:val="superscript"/>
+        </w:rPr>
+        <w:t>1</w:t>
+      </w:r>
+      <w:r>
+        <w:fldChar w:fldCharType="end"/>
+      </w:r>
+      <w:r>
+        <w:t xml:space="preserve">, it is often used sparingly, which may reduce the consistency with which hypercapnia is recognized in routine </w:t>
+      </w:r>
+      <w:commentRangeStart w:id="4"/>
+      <w:r>
+        <w:t>care</w:t>
+      </w:r>
+      <w:commentRangeEnd w:id="4"/>
       <w:r>
         <w:rPr>
           <w:rStyle w:val="CommentReference"/>
           <w:sz w:val="24"/>
           <w:szCs w:val="24"/>
         </w:rPr>
-        <w:commentReference w:id="5"/>
-      </w:r>
-      <w:r>
-        <w:t>k, but reliable recognition still nominally depends on arterial blood gas testing. Because arterial sampling is invasive, painful, and technically demanding</w:t>
-      </w:r>
-      <w:r>
-        <w:fldChar w:fldCharType="begin"/>
-      </w:r>
-      <w:r>
-        <w:instrText xml:space="preserve"> ADDIN ZOTERO_ITEM CSL_CITATION {"citationID":"ChvojsMO","properties":{"formattedCitation":"\\super 1\\nosupersub{}","plainCitation":"1","noteIndex":0},"citationItems":[{"id":6,"uris":["http://zotero.org/groups/6192411/items/CG6S42R4"],"itemData":{"id":6,"type":"article-journal","abstract":"Abstract Venous blood gases (VBGs) are safe and effective at screening for hypercarbic respiratory failure. Multiple studies have validated that a VBG with a PvCO2 less than 45 reliably rules out hypercarbia. The use of VBGs for the initial screening of hypercarbia when hypercarbic respiratory failure is suspected can reduce the overall use of arterial blood gases which are more painful and take more time and expertise to perform.","container-title":"Journal of Hospital Medicine","DOI":"10.1002/jhm.70039","ISSN":"1553-5592","issue":"9","journalAbbreviation":"Journal of Hospital Medicine","note":"PMID: 40183604\nPMCID: PMC12406756","page":"1002-1004","PMID":"40183604","PMCID":"PMC12406756","publisher":"John Wiley &amp; Sons, Ltd","title":"Things We Do for No Reason™: Arterial blood gas testing to screen for hypercarbic respiratory failure","volume":"20","author":[{"family":"Lacy","given":"Mary E."},{"family":"Saa","given":"Lisa"},{"family":"Bruss","given":"Zachary"},{"family":"Noronha","given":"Leonard"}],"issued":{"date-parts":[["2025",9,1]]}}}],"schema":"https://github.com/citation-style-language/schema/raw/master/csl-citation.json"} </w:instrText>
-      </w:r>
-      <w:r>
-        <w:fldChar w:fldCharType="separate"/>
-      </w:r>
-      <w:r>
-        <w:rPr>
-          <w:vertAlign w:val="superscript"/>
-        </w:rPr>
-        <w:t>1</w:t>
-      </w:r>
-      <w:r>
-        <w:fldChar w:fldCharType="end"/>
-      </w:r>
-      <w:r>
-        <w:t xml:space="preserve">, it is often used sparingly, which may reduce the consistency with which hypercapnia is recognized in routine </w:t>
-      </w:r>
+        <w:commentReference w:id="4"/>
+      </w:r>
+      <w:r>
+        <w:t xml:space="preserve">. By contrast, venous blood gases are easier to obtain, are readily integrated into routine blood-draw workflows, and are already used in some clinical settings as a </w:t>
+      </w:r>
+      <w:commentRangeStart w:id="5"/>
       <w:commentRangeStart w:id="6"/>
       <w:r>
-        <w:t>care</w:t>
-      </w:r>
-      <w:commentRangeEnd w:id="6"/>
+        <w:t>practical alternative</w:t>
+      </w:r>
+      <w:commentRangeEnd w:id="5"/>
       <w:r>
         <w:rPr>
           <w:rStyle w:val="CommentReference"/>
           <w:sz w:val="24"/>
           <w:szCs w:val="24"/>
         </w:rPr>
-        <w:commentReference w:id="6"/>
-      </w:r>
-      <w:r>
-        <w:t xml:space="preserve">. By contrast, venous blood gases are easier to obtain, are readily integrated into routine blood-draw workflows, and are already used in some clinical settings as a </w:t>
-      </w:r>
-      <w:commentRangeStart w:id="7"/>
-      <w:commentRangeStart w:id="8"/>
-      <w:r>
-        <w:t>practical alternative</w:t>
-      </w:r>
-      <w:commentRangeEnd w:id="7"/>
+        <w:commentReference w:id="5"/>
+      </w:r>
+      <w:commentRangeEnd w:id="6"/>
       <w:r>
         <w:rPr>
           <w:rStyle w:val="CommentReference"/>
           <w:sz w:val="24"/>
           <w:szCs w:val="24"/>
         </w:rPr>
-        <w:commentReference w:id="7"/>
-      </w:r>
-      <w:commentRangeEnd w:id="8"/>
+        <w:commentReference w:id="6"/>
+      </w:r>
+      <w:r>
+        <w:t xml:space="preserve">. If venous pCO₂ can identify patients who are likely to require intervention as well as arterial PaCO₂, it could support more reliable and more patient-centered recognition of hypercapnia, with arterial sampling reserved for cases in which it would alter </w:t>
+      </w:r>
+      <w:commentRangeStart w:id="7"/>
+      <w:r>
+        <w:t>management</w:t>
+      </w:r>
+      <w:commentRangeEnd w:id="7"/>
       <w:r>
         <w:rPr>
           <w:rStyle w:val="CommentReference"/>
           <w:sz w:val="24"/>
           <w:szCs w:val="24"/>
         </w:rPr>
-        <w:commentReference w:id="8"/>
-      </w:r>
-      <w:r>
-        <w:t xml:space="preserve">. If venous pCO₂ can identify patients who are likely to require intervention as well as arterial PaCO₂, it could support more reliable and more patient-centered recognition of hypercapnia, with arterial sampling reserved for cases in which it would alter </w:t>
-      </w:r>
+        <w:commentReference w:id="7"/>
+      </w:r>
+      <w:r>
+        <w:t>.</w:t>
+      </w:r>
+    </w:p>
+    <w:p>
+      <w:pPr>
+        <w:spacing w:after="240"/>
+      </w:pPr>
+      <w:r>
+        <w:t>The literature supporting venous blood gas</w:t>
+      </w:r>
+      <w:r>
+        <w:t xml:space="preserve"> (VBG)</w:t>
+      </w:r>
+      <w:r>
+        <w:t xml:space="preserve"> use is substantial but incomplete. Prior investigations have primarily examined </w:t>
+      </w:r>
+      <w:r>
+        <w:t>a</w:t>
+      </w:r>
+      <w:r>
+        <w:t xml:space="preserve">nalytic </w:t>
+      </w:r>
+      <w:commentRangeStart w:id="8"/>
       <w:commentRangeStart w:id="9"/>
       <w:r>
-        <w:t>management</w:t>
-      </w:r>
-      <w:commentRangeEnd w:id="9"/>
+        <w:t>agreement with arterial pCO</w:t>
+      </w:r>
+      <w:commentRangeEnd w:id="8"/>
       <w:r>
         <w:rPr>
           <w:rStyle w:val="CommentReference"/>
           <w:sz w:val="24"/>
           <w:szCs w:val="24"/>
         </w:rPr>
+        <w:commentReference w:id="8"/>
+      </w:r>
+      <w:commentRangeEnd w:id="9"/>
+      <w:r>
+        <w:rPr>
+          <w:rStyle w:val="CommentReference"/>
+          <w:sz w:val="24"/>
+          <w:szCs w:val="24"/>
+        </w:rPr>
         <w:commentReference w:id="9"/>
       </w:r>
       <w:r>
-        <w:t>.</w:t>
-      </w:r>
-    </w:p>
-    <w:p>
-      <w:pPr>
-        <w:spacing w:after="240"/>
-      </w:pPr>
-      <w:r>
-        <w:t>The literature supporting venous blood gas</w:t>
-      </w:r>
-      <w:r>
-        <w:t xml:space="preserve"> (VBG)</w:t>
-      </w:r>
-      <w:r>
-        <w:t xml:space="preserve"> use is substantial but incomplete. Prior investigations have primarily examined </w:t>
-      </w:r>
-      <w:r>
-        <w:t>a</w:t>
-      </w:r>
-      <w:r>
-        <w:t xml:space="preserve">nalytic </w:t>
+        <w:t xml:space="preserve">₂, </w:t>
       </w:r>
       <w:commentRangeStart w:id="10"/>
       <w:commentRangeStart w:id="11"/>
       <w:r>
-        <w:t>agreement with arterial pCO</w:t>
+        <w:t>arterialization formulas</w:t>
       </w:r>
       <w:commentRangeEnd w:id="10"/>
       <w:r>
@@ -925,12 +694,12 @@
         <w:commentReference w:id="11"/>
       </w:r>
       <w:r>
-        <w:t xml:space="preserve">₂, </w:t>
+        <w:t xml:space="preserve">, and </w:t>
       </w:r>
       <w:commentRangeStart w:id="12"/>
       <w:commentRangeStart w:id="13"/>
       <w:r>
-        <w:t>arterialization formulas</w:t>
+        <w:t>screening performance using ABG as the reference standard</w:t>
       </w:r>
       <w:commentRangeEnd w:id="12"/>
       <w:r>
@@ -951,12 +720,16 @@
         <w:commentReference w:id="13"/>
       </w:r>
       <w:r>
-        <w:t xml:space="preserve">, and </w:t>
+        <w:t>.</w:t>
+      </w:r>
+      <w:r>
+        <w:t xml:space="preserve"> These studies have yielded mixed results, with some suggesting close agreement or high sensitivity in selected settings and others showing enough variability to </w:t>
       </w:r>
       <w:commentRangeStart w:id="14"/>
       <w:commentRangeStart w:id="15"/>
-      <w:r>
-        <w:t>screening performance using ABG as the reference standard</w:t>
+      <w:commentRangeStart w:id="16"/>
+      <w:r>
+        <w:t>question analytic interchangeability</w:t>
       </w:r>
       <w:commentRangeEnd w:id="14"/>
       <w:r>
@@ -976,18 +749,6 @@
         </w:rPr>
         <w:commentReference w:id="15"/>
       </w:r>
-      <w:r>
-        <w:t>.</w:t>
-      </w:r>
-      <w:r>
-        <w:t xml:space="preserve"> These studies have yielded mixed results, with some suggesting close agreement or high sensitivity in selected settings and others showing enough variability to </w:t>
-      </w:r>
-      <w:commentRangeStart w:id="16"/>
-      <w:commentRangeStart w:id="17"/>
-      <w:commentRangeStart w:id="18"/>
-      <w:r>
-        <w:t>question analytic interchangeability</w:t>
-      </w:r>
       <w:commentRangeEnd w:id="16"/>
       <w:r>
         <w:rPr>
@@ -997,6 +758,16 @@
         </w:rPr>
         <w:commentReference w:id="16"/>
       </w:r>
+      <w:r>
+        <w:t xml:space="preserve">. </w:t>
+      </w:r>
+      <w:r>
+        <w:t xml:space="preserve">Yet analytic interchangeability is not the decision-relevant target. The clinically relevant question is whether venous pCO₂ distinguishes patients at higher risk of treatment escalation, ventilatory support, or death in a manner similar to </w:t>
+      </w:r>
+      <w:commentRangeStart w:id="17"/>
+      <w:r>
+        <w:t xml:space="preserve">arterial pCO₂. </w:t>
+      </w:r>
       <w:commentRangeEnd w:id="17"/>
       <w:r>
         <w:rPr>
@@ -1006,6 +777,10 @@
         </w:rPr>
         <w:commentReference w:id="17"/>
       </w:r>
+      <w:commentRangeStart w:id="18"/>
+      <w:r>
+        <w:t>That question remains unresolved.</w:t>
+      </w:r>
       <w:commentRangeEnd w:id="18"/>
       <w:r>
         <w:rPr>
@@ -1014,38 +789,6 @@
           <w:szCs w:val="24"/>
         </w:rPr>
         <w:commentReference w:id="18"/>
-      </w:r>
-      <w:r>
-        <w:t xml:space="preserve">. </w:t>
-      </w:r>
-      <w:r>
-        <w:t xml:space="preserve">Yet analytic interchangeability is not the decision-relevant target. The clinically relevant question is whether venous pCO₂ distinguishes patients at higher risk of treatment escalation, ventilatory support, or death in a manner similar to </w:t>
-      </w:r>
-      <w:commentRangeStart w:id="19"/>
-      <w:r>
-        <w:t xml:space="preserve">arterial pCO₂. </w:t>
-      </w:r>
-      <w:commentRangeEnd w:id="19"/>
-      <w:r>
-        <w:rPr>
-          <w:rStyle w:val="CommentReference"/>
-          <w:sz w:val="24"/>
-          <w:szCs w:val="24"/>
-        </w:rPr>
-        <w:commentReference w:id="19"/>
-      </w:r>
-      <w:commentRangeStart w:id="20"/>
-      <w:r>
-        <w:t>That question remains unresolved.</w:t>
-      </w:r>
-      <w:commentRangeEnd w:id="20"/>
-      <w:r>
-        <w:rPr>
-          <w:rStyle w:val="CommentReference"/>
-          <w:sz w:val="24"/>
-          <w:szCs w:val="24"/>
-        </w:rPr>
-        <w:commentReference w:id="20"/>
       </w:r>
     </w:p>
     <w:p>
@@ -1261,7 +1004,8 @@
       <w:r>
         <w:t>). Ambulatory encounters were excluded</w:t>
       </w:r>
-      <w:commentRangeStart w:id="21"/>
+      <w:commentRangeStart w:id="19"/>
+      <w:commentRangeStart w:id="20"/>
       <w:r>
         <w:t>.</w:t>
       </w:r>
@@ -1274,144 +1018,153 @@
         </w:rPr>
         <w:t> </w:t>
       </w:r>
-      <w:commentRangeEnd w:id="21"/>
+      <w:commentRangeEnd w:id="19"/>
       <w:r>
         <w:rPr>
           <w:rStyle w:val="CommentReference"/>
           <w:sz w:val="24"/>
           <w:szCs w:val="24"/>
         </w:rPr>
-        <w:commentReference w:id="21"/>
-      </w:r>
-      <w:r>
-        <w:t>Encounters meeting the hypercapnia-suspicion phenotype but without blood gas testing were retained in the source cohort for estimation of test-ordering propensity, whereas exposure-outcome analyses were performed within the ABG-tested and VBG-tested cohorts. Procedure and diagnosis codes were used to define a broad source population in whom clinicians would plausibly consider hypercapnia, rather than to define the exposure itself.</w:t>
-      </w:r>
-      <w:r>
-        <w:t xml:space="preserve"> </w:t>
-      </w:r>
-    </w:p>
-    <w:p>
-      <w:pPr>
-        <w:pStyle w:val="Subtitle"/>
-        <w:rPr>
-          <w:bCs/>
-        </w:rPr>
-      </w:pPr>
-      <w:r>
-        <w:rPr>
-          <w:bCs/>
-        </w:rPr>
-        <w:t>Exposure</w:t>
-      </w:r>
-      <w:r>
-        <w:rPr>
-          <w:bCs/>
-        </w:rPr>
-        <w:t>, Outcomes, and Covaria</w:t>
-      </w:r>
-      <w:r>
-        <w:rPr>
-          <w:bCs/>
-        </w:rPr>
-        <w:t>t</w:t>
-      </w:r>
-      <w:r>
-        <w:rPr>
-          <w:bCs/>
-        </w:rPr>
-        <w:t>es</w:t>
-      </w:r>
-    </w:p>
-    <w:p>
-      <w:r>
-        <w:t xml:space="preserve">Exposure was defined using the </w:t>
-      </w:r>
-      <w:r>
-        <w:t>first arterial or venous pCO₂ measured on day 0</w:t>
-      </w:r>
-      <w:r>
-        <w:t xml:space="preserve"> of the index encounter</w:t>
-      </w:r>
-      <w:r>
-        <w:t xml:space="preserve">. </w:t>
-      </w:r>
-      <w:r>
-        <w:t xml:space="preserve">For encounters with both arterial and venous blood gases on day 0, ABG and VBG analyses were conducted in separate test-specific cohorts using the first value of each type. We evaluated four prespecified outcomes: hypercapnic respiratory failure diagnosis during the index encounter, receipt of non-invasive ventilation during the hospitalization, receipt of invasive mechanical ventilation during the hospitalization, and all-cause mortality within 60 days of encounter start. </w:t>
-      </w:r>
-      <w:r>
-        <w:t>The 60-day window was selected based on ARDS literature, where this time point captures the greatest intervention-related mortality differences, reflecting the period when deaths attributable to respiratory failure and its management are most apparent</w:t>
-      </w:r>
-      <w:r>
-        <w:t>. Specific LOINC codes (for b</w:t>
-      </w:r>
-      <w:r>
-        <w:t>lood-gas</w:t>
-      </w:r>
-      <w:r>
-        <w:t xml:space="preserve"> </w:t>
-      </w:r>
-      <w:commentRangeStart w:id="22"/>
-      <w:r>
-        <w:t>testing</w:t>
-      </w:r>
-      <w:commentRangeEnd w:id="22"/>
+        <w:commentReference w:id="19"/>
+      </w:r>
+      <w:commentRangeEnd w:id="20"/>
       <w:r>
         <w:rPr>
           <w:rStyle w:val="CommentReference"/>
           <w:sz w:val="24"/>
           <w:szCs w:val="24"/>
         </w:rPr>
-        <w:commentReference w:id="22"/>
-      </w:r>
-      <w:r>
-        <w:t xml:space="preserve">), ICD-10-PCS and CPT codes (for ventilation support) and ICD-10-CM codes (for </w:t>
-      </w:r>
-      <w:commentRangeStart w:id="23"/>
-      <w:r>
-        <w:t>hypercapnia diagnosis</w:t>
-      </w:r>
-      <w:commentRangeEnd w:id="23"/>
+        <w:commentReference w:id="20"/>
+      </w:r>
+      <w:r>
+        <w:t>Encounters meeting the hypercapnia-suspicion phenotype but without blood gas testing were retained in the source cohort for estimation of test-ordering propensity, whereas exposure-outcome analyses were performed within the ABG-tested and VBG-tested cohorts. Procedure and diagnosis codes were used to define a broad source population in whom clinicians would plausibly consider hypercapnia, rather than to define the exposure itself.</w:t>
+      </w:r>
+      <w:r>
+        <w:t xml:space="preserve"> </w:t>
+      </w:r>
+    </w:p>
+    <w:p>
+      <w:pPr>
+        <w:pStyle w:val="Subtitle"/>
+        <w:rPr>
+          <w:bCs/>
+        </w:rPr>
+      </w:pPr>
+      <w:r>
+        <w:rPr>
+          <w:bCs/>
+        </w:rPr>
+        <w:t>Exposure</w:t>
+      </w:r>
+      <w:r>
+        <w:rPr>
+          <w:bCs/>
+        </w:rPr>
+        <w:t>, Outcomes, and Covaria</w:t>
+      </w:r>
+      <w:r>
+        <w:rPr>
+          <w:bCs/>
+        </w:rPr>
+        <w:t>t</w:t>
+      </w:r>
+      <w:r>
+        <w:rPr>
+          <w:bCs/>
+        </w:rPr>
+        <w:t>es</w:t>
+      </w:r>
+    </w:p>
+    <w:p>
+      <w:r>
+        <w:t xml:space="preserve">Exposure was defined using the </w:t>
+      </w:r>
+      <w:r>
+        <w:t>first arterial or venous pCO₂ measured on day 0</w:t>
+      </w:r>
+      <w:r>
+        <w:t xml:space="preserve"> of the index encounter</w:t>
+      </w:r>
+      <w:r>
+        <w:t xml:space="preserve">. </w:t>
+      </w:r>
+      <w:r>
+        <w:t xml:space="preserve">For encounters with both arterial and venous blood gases on day 0, ABG and VBG analyses were conducted in separate test-specific cohorts using the first value of each type. We evaluated four prespecified outcomes: hypercapnic respiratory failure diagnosis during the index encounter, receipt of non-invasive ventilation during the hospitalization, receipt of invasive mechanical ventilation during the hospitalization, and all-cause mortality within 60 days of encounter start. </w:t>
+      </w:r>
+      <w:r>
+        <w:t>The 60-day window was selected based on ARDS literature, where this time point captures the greatest intervention-related mortality differences, reflecting the period when deaths attributable to respiratory failure and its management are most apparent</w:t>
+      </w:r>
+      <w:r>
+        <w:t>. Specific LOINC codes (for b</w:t>
+      </w:r>
+      <w:r>
+        <w:t>lood-gas</w:t>
+      </w:r>
+      <w:r>
+        <w:t xml:space="preserve"> </w:t>
+      </w:r>
+      <w:commentRangeStart w:id="21"/>
+      <w:r>
+        <w:t>testing</w:t>
+      </w:r>
+      <w:commentRangeEnd w:id="21"/>
       <w:r>
         <w:rPr>
           <w:rStyle w:val="CommentReference"/>
           <w:sz w:val="24"/>
           <w:szCs w:val="24"/>
         </w:rPr>
-        <w:commentReference w:id="23"/>
-      </w:r>
-      <w:r>
-        <w:t xml:space="preserve">) </w:t>
-      </w:r>
-      <w:r>
-        <w:t>are provided in e-Appendix 4.</w:t>
-      </w:r>
-      <w:r>
-        <w:t xml:space="preserve"> Because </w:t>
-      </w:r>
-      <w:r>
-        <w:t xml:space="preserve">exact temporal ordering of diagnosis and ventilatory procedures relative to the initial blood gas could not be established reliably for all encounters, diagnosis, non-invasive ventilation, and invasive mechanical ventilation were treated as </w:t>
-      </w:r>
-      <w:r>
-        <w:t>encounter-level outcomes</w:t>
-      </w:r>
-      <w:r>
-        <w:t xml:space="preserve"> rather than strictly post-exposure events. </w:t>
-      </w:r>
-      <w:r>
-        <w:t xml:space="preserve">Covariates used in the sampling models were prespecified to reflect factors plausibly related to both test ordering and outcomes and included encounter type, demographic characteristics, comorbid conditions, initial vital signs, and basic initial laboratory values. Weighted outcome models included additional direct adjustment for age, sex, race/ethnicity, location, </w:t>
-      </w:r>
-      <w:commentRangeStart w:id="24"/>
-      <w:r>
-        <w:t>and encounter type</w:t>
-      </w:r>
-      <w:commentRangeEnd w:id="24"/>
+        <w:commentReference w:id="21"/>
+      </w:r>
+      <w:r>
+        <w:t xml:space="preserve">), ICD-10-PCS and CPT codes (for ventilation support) and ICD-10-CM codes (for </w:t>
+      </w:r>
+      <w:commentRangeStart w:id="22"/>
+      <w:r>
+        <w:t>hypercapnia diagnosis</w:t>
+      </w:r>
+      <w:commentRangeEnd w:id="22"/>
       <w:r>
         <w:rPr>
           <w:rStyle w:val="CommentReference"/>
           <w:sz w:val="24"/>
           <w:szCs w:val="24"/>
         </w:rPr>
-        <w:commentReference w:id="24"/>
+        <w:commentReference w:id="22"/>
+      </w:r>
+      <w:r>
+        <w:t xml:space="preserve">) </w:t>
+      </w:r>
+      <w:r>
+        <w:t>are provided in e-Appendix 4.</w:t>
+      </w:r>
+      <w:r>
+        <w:t xml:space="preserve"> Because </w:t>
+      </w:r>
+      <w:r>
+        <w:t xml:space="preserve">exact temporal ordering of diagnosis and ventilatory procedures relative to the initial blood gas could not be established reliably for all encounters, diagnosis, non-invasive ventilation, and invasive mechanical ventilation were treated as </w:t>
+      </w:r>
+      <w:r>
+        <w:t>encounter-level outcomes</w:t>
+      </w:r>
+      <w:r>
+        <w:t xml:space="preserve"> rather than strictly post-exposure events. </w:t>
+      </w:r>
+      <w:r>
+        <w:t xml:space="preserve">Covariates used in the sampling models were prespecified to reflect factors plausibly related to both test ordering and outcomes and included encounter type, demographic characteristics, comorbid conditions, initial vital signs, and basic initial laboratory values. Weighted outcome models included additional direct adjustment for age, sex, race/ethnicity, location, </w:t>
+      </w:r>
+      <w:commentRangeStart w:id="23"/>
+      <w:r>
+        <w:t>and encounter type</w:t>
+      </w:r>
+      <w:commentRangeEnd w:id="23"/>
+      <w:r>
+        <w:rPr>
+          <w:rStyle w:val="CommentReference"/>
+          <w:sz w:val="24"/>
+          <w:szCs w:val="24"/>
+        </w:rPr>
+        <w:commentReference w:id="23"/>
       </w:r>
       <w:r>
         <w:t>.</w:t>
@@ -1457,18 +1210,18 @@
       <w:r>
         <w:t xml:space="preserve">The primary analytic goal was to compare prognostic associations of arterial and venous pCO₂ within the same underlying clinical population rather than within the raw groups who happened to receive each test. We therefore used inverse probability-of-sampling weighting (IPSW) based on separate models for ABG and VBG receipt among all encounters meeting the hypercapnia-suspicion phenotype. This approach generated two weighted pseudo-populations, each representing the same target population of encounters in which hypercapnia would plausibly be </w:t>
       </w:r>
-      <w:commentRangeStart w:id="25"/>
+      <w:commentRangeStart w:id="24"/>
       <w:r>
         <w:t>considered</w:t>
       </w:r>
-      <w:commentRangeEnd w:id="25"/>
+      <w:commentRangeEnd w:id="24"/>
       <w:r>
         <w:rPr>
           <w:rStyle w:val="CommentReference"/>
           <w:sz w:val="24"/>
           <w:szCs w:val="24"/>
         </w:rPr>
-        <w:commentReference w:id="25"/>
+        <w:commentReference w:id="24"/>
       </w:r>
       <w:r>
         <w:t xml:space="preserve">. </w:t>
@@ -1482,28 +1235,28 @@
       <w:r>
         <w:t xml:space="preserve"> conditional on the covariates included in the weighting </w:t>
       </w:r>
+      <w:commentRangeStart w:id="25"/>
       <w:commentRangeStart w:id="26"/>
-      <w:commentRangeStart w:id="27"/>
       <w:r>
         <w:t>models.</w:t>
       </w:r>
-      <w:commentRangeEnd w:id="26"/>
+      <w:commentRangeEnd w:id="25"/>
       <w:r>
         <w:rPr>
           <w:rStyle w:val="CommentReference"/>
           <w:sz w:val="24"/>
           <w:szCs w:val="24"/>
         </w:rPr>
-        <w:commentReference w:id="26"/>
-      </w:r>
-      <w:commentRangeEnd w:id="27"/>
+        <w:commentReference w:id="25"/>
+      </w:r>
+      <w:commentRangeEnd w:id="26"/>
       <w:r>
         <w:rPr>
           <w:rStyle w:val="CommentReference"/>
           <w:sz w:val="24"/>
           <w:szCs w:val="24"/>
         </w:rPr>
-        <w:commentReference w:id="27"/>
+        <w:commentReference w:id="26"/>
       </w:r>
     </w:p>
     <w:p>
@@ -1525,18 +1278,18 @@
       <w:r>
         <w:t xml:space="preserve">Missing baseline covariates were handled using multiple imputation by chained equations in the full eligible analytic cohort after exclusion of ambulatory encounters and before restriction to the ABG-tested or VBG-tested outcome cohorts. We generated </w:t>
       </w:r>
-      <w:commentRangeStart w:id="28"/>
+      <w:commentRangeStart w:id="27"/>
       <w:r>
         <w:t>80 imputed datasets</w:t>
       </w:r>
-      <w:commentRangeEnd w:id="28"/>
+      <w:commentRangeEnd w:id="27"/>
       <w:r>
         <w:rPr>
           <w:rStyle w:val="CommentReference"/>
           <w:sz w:val="24"/>
           <w:szCs w:val="24"/>
         </w:rPr>
-        <w:commentReference w:id="28"/>
+        <w:commentReference w:id="27"/>
       </w:r>
       <w:r>
         <w:t xml:space="preserve"> with 20 iterations each. </w:t>
@@ -1547,18 +1300,18 @@
       <w:r>
         <w:t xml:space="preserve"> Test-specific pCO₂ exposure values were not imputed, and outcome analyses remained restricted to encounters with observed ABG or VBG pCO₂ values. Propensity models and weighted outcome models were refit within each imputed dataset, and estimates were pooled using </w:t>
       </w:r>
-      <w:commentRangeStart w:id="29"/>
+      <w:commentRangeStart w:id="28"/>
       <w:r>
         <w:t>Rubin’s rules.</w:t>
       </w:r>
-      <w:commentRangeEnd w:id="29"/>
+      <w:commentRangeEnd w:id="28"/>
       <w:r>
         <w:rPr>
           <w:rStyle w:val="CommentReference"/>
           <w:sz w:val="24"/>
           <w:szCs w:val="24"/>
         </w:rPr>
-        <w:commentReference w:id="29"/>
+        <w:commentReference w:id="28"/>
       </w:r>
     </w:p>
     <w:p>
@@ -1586,38 +1339,38 @@
       <w:r>
         <w:t xml:space="preserve"> One-sided inverse probability-of-sampling weights were then derived for tested encounters as the inverse of the estimated testing probability. To limit the influence of extreme weights, propensities below the 1st percentile of the tested group were</w:t>
       </w:r>
+      <w:commentRangeStart w:id="29"/>
       <w:commentRangeStart w:id="30"/>
       <w:commentRangeStart w:id="31"/>
-      <w:commentRangeStart w:id="32"/>
       <w:r>
         <w:t xml:space="preserve"> floored </w:t>
       </w:r>
-      <w:commentRangeEnd w:id="30"/>
+      <w:commentRangeEnd w:id="29"/>
       <w:r>
         <w:rPr>
           <w:rStyle w:val="CommentReference"/>
           <w:sz w:val="24"/>
           <w:szCs w:val="24"/>
         </w:rPr>
-        <w:commentReference w:id="30"/>
-      </w:r>
-      <w:commentRangeEnd w:id="31"/>
+        <w:commentReference w:id="29"/>
+      </w:r>
+      <w:commentRangeEnd w:id="30"/>
       <w:r>
         <w:rPr>
           <w:rStyle w:val="CommentReference"/>
           <w:sz w:val="24"/>
           <w:szCs w:val="24"/>
         </w:rPr>
-        <w:commentReference w:id="31"/>
-      </w:r>
-      <w:commentRangeEnd w:id="32"/>
+        <w:commentReference w:id="30"/>
+      </w:r>
+      <w:commentRangeEnd w:id="31"/>
       <w:r>
         <w:rPr>
           <w:rStyle w:val="CommentReference"/>
           <w:sz w:val="24"/>
           <w:szCs w:val="24"/>
         </w:rPr>
-        <w:commentReference w:id="32"/>
+        <w:commentReference w:id="31"/>
       </w:r>
       <w:r>
         <w:t xml:space="preserve">at that value before weighting, and the resulting weights were </w:t>
@@ -1630,18 +1383,18 @@
       <w:r>
         <w:t xml:space="preserve">After weighting, associations between pCO₂ and each outcome were estimated separately within the ABG-tested and VBG-tested cohorts using survey-weighted logistic regression with additional adjustment for age, sex, race/ethnicity, location, and </w:t>
       </w:r>
-      <w:commentRangeStart w:id="33"/>
+      <w:commentRangeStart w:id="32"/>
       <w:r>
         <w:t>encounter type</w:t>
       </w:r>
-      <w:commentRangeEnd w:id="33"/>
+      <w:commentRangeEnd w:id="32"/>
       <w:r>
         <w:rPr>
           <w:rStyle w:val="CommentReference"/>
           <w:sz w:val="24"/>
           <w:szCs w:val="24"/>
         </w:rPr>
-        <w:commentReference w:id="33"/>
+        <w:commentReference w:id="32"/>
       </w:r>
       <w:r>
         <w:t xml:space="preserve">. </w:t>
@@ -1671,38 +1424,25 @@
         <w:t xml:space="preserve">s </w:t>
       </w:r>
       <w:r>
-        <w:t>with 4 degrees of freedom to allow for non-linear associations. For categorical models, odds ratios and 95% confidence intervals were estimated using the normal pCO₂ group as the reference. For spline models, adjusted outcome curves with 95% confidence intervals were generated over the central observed pCO₂ range, defined as the</w:t>
-      </w:r>
-      <w:commentRangeStart w:id="34"/>
-      <w:r>
-        <w:t xml:space="preserve"> 2nd to 98th percentiles.</w:t>
-      </w:r>
-      <w:commentRangeEnd w:id="34"/>
+        <w:t>with 4 degrees of freedom to allow for non-linear associations. For categorical models, odds ratios and 95% confidence intervals were estimated using the normal pCO₂ group as the reference. For spline models, adjusted outcome curves with 95% confidence intervals were generated over the central observed pCO₂ range, defined as the 2nd to 98th percentiles.</w:t>
+      </w:r>
+    </w:p>
+    <w:p>
+      <w:r>
+        <w:t xml:space="preserve">Covariate balance before and after weighting was assessed using standardized mean differences, with absolute values below 0.1 considered </w:t>
+      </w:r>
+      <w:commentRangeStart w:id="33"/>
+      <w:r>
+        <w:t>acceptable</w:t>
+      </w:r>
+      <w:commentRangeEnd w:id="33"/>
       <w:r>
         <w:rPr>
           <w:rStyle w:val="CommentReference"/>
           <w:sz w:val="24"/>
           <w:szCs w:val="24"/>
         </w:rPr>
-        <w:commentReference w:id="34"/>
-      </w:r>
-    </w:p>
-    <w:p>
-      <w:r>
-        <w:t xml:space="preserve">Covariate balance before and after weighting was assessed using standardized mean differences, with absolute values below 0.1 considered </w:t>
-      </w:r>
-      <w:commentRangeStart w:id="35"/>
-      <w:r>
-        <w:t>acceptable</w:t>
-      </w:r>
-      <w:commentRangeEnd w:id="35"/>
-      <w:r>
-        <w:rPr>
-          <w:rStyle w:val="CommentReference"/>
-          <w:sz w:val="24"/>
-          <w:szCs w:val="24"/>
-        </w:rPr>
-        <w:commentReference w:id="35"/>
+        <w:commentReference w:id="33"/>
       </w:r>
       <w:r>
         <w:t>. Propensity-score distributions were also examined to assess overlap and support the positivity assumption.</w:t>
@@ -1765,15 +1505,15 @@
         </w:rPr>
         <w:t xml:space="preserve">As a sensitivity analysis, we repeated the weighting analysis in the non-imputed dataset using gradient-boosted propensity models for ABG and VBG </w:t>
       </w:r>
-      <w:commentRangeStart w:id="36"/>
-      <w:commentRangeStart w:id="37"/>
+      <w:commentRangeStart w:id="34"/>
+      <w:commentRangeStart w:id="35"/>
       <w:r>
         <w:rPr>
           <w:rFonts w:eastAsiaTheme="minorHAnsi"/>
         </w:rPr>
         <w:t xml:space="preserve">receipt, </w:t>
       </w:r>
-      <w:commentRangeEnd w:id="36"/>
+      <w:commentRangeEnd w:id="34"/>
       <w:r>
         <w:rPr>
           <w:rStyle w:val="CommentReference"/>
@@ -1781,9 +1521,9 @@
           <w:sz w:val="24"/>
           <w:szCs w:val="24"/>
         </w:rPr>
-        <w:commentReference w:id="36"/>
-      </w:r>
-      <w:commentRangeEnd w:id="37"/>
+        <w:commentReference w:id="34"/>
+      </w:r>
+      <w:commentRangeEnd w:id="35"/>
       <w:r>
         <w:rPr>
           <w:rStyle w:val="CommentReference"/>
@@ -1791,7 +1531,7 @@
           <w:sz w:val="24"/>
           <w:szCs w:val="24"/>
         </w:rPr>
-        <w:commentReference w:id="37"/>
+        <w:commentReference w:id="35"/>
       </w:r>
       <w:r>
         <w:rPr>
@@ -1799,14 +1539,14 @@
         </w:rPr>
         <w:t xml:space="preserve">with incomplete predictors handled using WeightIt’s missing-indicator </w:t>
       </w:r>
-      <w:commentRangeStart w:id="38"/>
+      <w:commentRangeStart w:id="36"/>
       <w:r>
         <w:rPr>
           <w:rFonts w:eastAsiaTheme="minorHAnsi"/>
         </w:rPr>
         <w:t>approach</w:t>
       </w:r>
-      <w:commentRangeEnd w:id="38"/>
+      <w:commentRangeEnd w:id="36"/>
       <w:r>
         <w:rPr>
           <w:rStyle w:val="CommentReference"/>
@@ -1814,7 +1554,7 @@
           <w:sz w:val="24"/>
           <w:szCs w:val="24"/>
         </w:rPr>
-        <w:commentReference w:id="38"/>
+        <w:commentReference w:id="36"/>
       </w:r>
       <w:r>
         <w:rPr>
@@ -1834,20 +1574,20 @@
         </w:rPr>
         <w:t xml:space="preserve">Supplementary diagnostics for the gradient-boosted models included SHAP summaries to characterize predictors of test </w:t>
       </w:r>
-      <w:commentRangeStart w:id="39"/>
+      <w:commentRangeStart w:id="37"/>
       <w:r>
         <w:rPr>
           <w:rFonts w:eastAsiaTheme="minorHAnsi"/>
         </w:rPr>
         <w:t>ordering.</w:t>
       </w:r>
-      <w:commentRangeEnd w:id="39"/>
+      <w:commentRangeEnd w:id="37"/>
       <w:r>
         <w:rPr>
           <w:rStyle w:val="CommentReference"/>
           <w:sz w:val="24"/>
           <w:szCs w:val="24"/>
-          <w:rPrChange w:id="40" w:author="Brian Locke" w:date="2026-04-08T21:47:00Z">
+          <w:rPrChange w:id="38" w:author="Brian Locke" w:date="2026-04-08T21:47:00Z">
             <w:rPr>
               <w:rStyle w:val="CommentReference"/>
               <w:sz w:val="24"/>
@@ -1855,7 +1595,7 @@
             </w:rPr>
           </w:rPrChange>
         </w:rPr>
-        <w:commentReference w:id="39"/>
+        <w:commentReference w:id="37"/>
       </w:r>
     </w:p>
     <w:p>
@@ -1888,18 +1628,18 @@
       <w:pPr>
         <w:pStyle w:val="Title"/>
       </w:pPr>
-      <w:commentRangeStart w:id="41"/>
+      <w:commentRangeStart w:id="39"/>
       <w:r>
         <w:t>Results:</w:t>
       </w:r>
-      <w:commentRangeEnd w:id="41"/>
+      <w:commentRangeEnd w:id="39"/>
       <w:r>
         <w:rPr>
           <w:rStyle w:val="CommentReference"/>
           <w:sz w:val="24"/>
           <w:szCs w:val="22"/>
         </w:rPr>
-        <w:commentReference w:id="41"/>
+        <w:commentReference w:id="39"/>
       </w:r>
     </w:p>
     <w:p>
@@ -1909,18 +1649,18 @@
       <w:r>
         <w:t>Cohort assembly and analytic s</w:t>
       </w:r>
-      <w:commentRangeStart w:id="42"/>
+      <w:commentRangeStart w:id="40"/>
       <w:r>
         <w:t>ample</w:t>
       </w:r>
-      <w:commentRangeEnd w:id="42"/>
+      <w:commentRangeEnd w:id="40"/>
       <w:r>
         <w:rPr>
           <w:rStyle w:val="CommentReference"/>
           <w:sz w:val="24"/>
           <w:szCs w:val="22"/>
         </w:rPr>
-        <w:commentReference w:id="42"/>
+        <w:commentReference w:id="40"/>
       </w:r>
     </w:p>
     <w:p>
@@ -1938,18 +1678,18 @@
       <w:r>
         <w:t xml:space="preserve">Baseline characteristics </w:t>
       </w:r>
-      <w:commentRangeStart w:id="43"/>
+      <w:commentRangeStart w:id="41"/>
       <w:r>
         <w:t>and test-ordering differences</w:t>
       </w:r>
-      <w:commentRangeEnd w:id="43"/>
+      <w:commentRangeEnd w:id="41"/>
       <w:r>
         <w:rPr>
           <w:rStyle w:val="CommentReference"/>
           <w:sz w:val="24"/>
           <w:szCs w:val="22"/>
         </w:rPr>
-        <w:commentReference w:id="43"/>
+        <w:commentReference w:id="41"/>
       </w:r>
     </w:p>
     <w:p>
@@ -1970,18 +1710,18 @@
       <w:pPr>
         <w:pStyle w:val="Subtitle"/>
       </w:pPr>
-      <w:commentRangeStart w:id="44"/>
+      <w:commentRangeStart w:id="42"/>
       <w:r>
         <w:t>Primary weighted analyses</w:t>
       </w:r>
-      <w:commentRangeEnd w:id="44"/>
+      <w:commentRangeEnd w:id="42"/>
       <w:r>
         <w:rPr>
           <w:rStyle w:val="CommentReference"/>
           <w:sz w:val="24"/>
           <w:szCs w:val="22"/>
         </w:rPr>
-        <w:commentReference w:id="44"/>
+        <w:commentReference w:id="42"/>
       </w:r>
     </w:p>
     <w:p>
@@ -2024,18 +1764,18 @@
       <w:pPr>
         <w:pStyle w:val="Subtitle"/>
       </w:pPr>
-      <w:commentRangeStart w:id="45"/>
+      <w:commentRangeStart w:id="43"/>
       <w:r>
         <w:t>Secondary analyses</w:t>
       </w:r>
-      <w:commentRangeEnd w:id="45"/>
+      <w:commentRangeEnd w:id="43"/>
       <w:r>
         <w:rPr>
           <w:rStyle w:val="CommentReference"/>
           <w:sz w:val="24"/>
           <w:szCs w:val="22"/>
         </w:rPr>
-        <w:commentReference w:id="45"/>
+        <w:commentReference w:id="43"/>
       </w:r>
     </w:p>
     <w:p>
@@ -2050,18 +1790,18 @@
       <w:r>
         <w:t xml:space="preserve">Sensitivity analyses and </w:t>
       </w:r>
-      <w:commentRangeStart w:id="46"/>
+      <w:commentRangeStart w:id="44"/>
       <w:r>
         <w:t>diagnostics</w:t>
       </w:r>
-      <w:commentRangeEnd w:id="46"/>
+      <w:commentRangeEnd w:id="44"/>
       <w:r>
         <w:rPr>
           <w:rStyle w:val="CommentReference"/>
           <w:sz w:val="24"/>
           <w:szCs w:val="22"/>
         </w:rPr>
-        <w:commentReference w:id="46"/>
+        <w:commentReference w:id="44"/>
       </w:r>
     </w:p>
     <w:p>
@@ -2099,47 +1839,47 @@
       <w:r>
         <w:t>Earlier work on ABG and VBG comparison has largely asked a narrower question than the one addressed here. Most studies evaluated analytic agreement, venous screening thresholds for arterial hypercapnia, or formulas intended to estimate arterial values from venous s</w:t>
       </w:r>
-      <w:commentRangeStart w:id="47"/>
+      <w:commentRangeStart w:id="45"/>
       <w:r>
         <w:t>amples</w:t>
       </w:r>
-      <w:commentRangeEnd w:id="47"/>
+      <w:commentRangeEnd w:id="45"/>
       <w:r>
         <w:rPr>
           <w:rStyle w:val="CommentReference"/>
           <w:sz w:val="24"/>
           <w:szCs w:val="24"/>
         </w:rPr>
-        <w:commentReference w:id="47"/>
+        <w:commentReference w:id="45"/>
       </w:r>
       <w:r>
         <w:t xml:space="preserve">; a 2024 systematic review concluded that the clinical impacts of choosing ABG vs VBG remained largely </w:t>
       </w:r>
-      <w:commentRangeStart w:id="48"/>
+      <w:commentRangeStart w:id="46"/>
       <w:r>
         <w:t xml:space="preserve">unknown. </w:t>
       </w:r>
-      <w:commentRangeEnd w:id="48"/>
+      <w:commentRangeEnd w:id="46"/>
       <w:r>
         <w:rPr>
           <w:rStyle w:val="CommentReference"/>
           <w:sz w:val="24"/>
           <w:szCs w:val="24"/>
         </w:rPr>
-        <w:commentReference w:id="48"/>
-      </w:r>
-      <w:commentRangeStart w:id="49"/>
+        <w:commentReference w:id="46"/>
+      </w:r>
+      <w:commentRangeStart w:id="47"/>
       <w:r>
         <w:t>Körver et al.</w:t>
       </w:r>
-      <w:commentRangeEnd w:id="49"/>
+      <w:commentRangeEnd w:id="47"/>
       <w:r>
         <w:rPr>
           <w:rStyle w:val="CommentReference"/>
           <w:sz w:val="24"/>
           <w:szCs w:val="24"/>
         </w:rPr>
-        <w:commentReference w:id="49"/>
+        <w:commentReference w:id="47"/>
       </w:r>
       <w:r>
         <w:t xml:space="preserve"> then examined whether venous testing plus pulse oximetry could replace ABG for treatment and disposition decisions in the ED, but even that design did not assess whether arterial and venous pCO₂ show similar associations with later clinically important outcomes. </w:t>
@@ -2208,19 +1948,19 @@
       <w:pPr>
         <w:pStyle w:val="Title"/>
       </w:pPr>
-      <w:commentRangeStart w:id="50"/>
+      <w:commentRangeStart w:id="48"/>
       <w:r>
         <w:lastRenderedPageBreak/>
         <w:t xml:space="preserve">References: </w:t>
       </w:r>
-      <w:commentRangeEnd w:id="50"/>
+      <w:commentRangeEnd w:id="48"/>
       <w:r>
         <w:rPr>
           <w:rStyle w:val="CommentReference"/>
           <w:sz w:val="24"/>
           <w:szCs w:val="22"/>
         </w:rPr>
-        <w:commentReference w:id="50"/>
+        <w:commentReference w:id="48"/>
       </w:r>
     </w:p>
     <w:p>
@@ -2778,18 +2518,8 @@
       </w:r>
     </w:p>
     <w:p>
-      <w:commentRangeStart w:id="51"/>
       <w:r>
         <w:t xml:space="preserve">Things like the propensity diagnostics could be included in the supplement. </w:t>
-      </w:r>
-      <w:commentRangeEnd w:id="51"/>
-      <w:r>
-        <w:rPr>
-          <w:rStyle w:val="CommentReference"/>
-          <w:sz w:val="24"/>
-          <w:szCs w:val="24"/>
-        </w:rPr>
-        <w:commentReference w:id="51"/>
       </w:r>
     </w:p>
     <w:p>
@@ -4901,7 +4631,7 @@
 
 <file path=word/comments.xml><?xml version="1.0" encoding="utf-8"?>
 <w:comments xmlns:wpc="http://schemas.microsoft.com/office/word/2010/wordprocessingCanvas" xmlns:cx="http://schemas.microsoft.com/office/drawing/2014/chartex" xmlns:cx1="http://schemas.microsoft.com/office/drawing/2015/9/8/chartex" xmlns:cx2="http://schemas.microsoft.com/office/drawing/2015/10/21/chartex" xmlns:cx3="http://schemas.microsoft.com/office/drawing/2016/5/9/chartex" xmlns:cx4="http://schemas.microsoft.com/office/drawing/2016/5/10/chartex" xmlns:cx5="http://schemas.microsoft.com/office/drawing/2016/5/11/chartex" xmlns:cx6="http://schemas.microsoft.com/office/drawing/2016/5/12/chartex" xmlns:cx7="http://schemas.microsoft.com/office/drawing/2016/5/13/chartex" xmlns:cx8="http://schemas.microsoft.com/office/drawing/2016/5/14/chartex" xmlns:mc="http://schemas.openxmlformats.org/markup-compatibility/2006" xmlns:aink="http://schemas.microsoft.com/office/drawing/2016/ink" xmlns:am3d="http://schemas.microsoft.com/office/drawing/2017/model3d" xmlns:o="urn:schemas-microsoft-com:office:office" xmlns:oel="http://schemas.microsoft.com/office/2019/extlst" xmlns:r="http://schemas.openxmlformats.org/officeDocument/2006/relationships" xmlns:m="http://schemas.openxmlformats.org/officeDocument/2006/math" xmlns:v="urn:schemas-microsoft-com:vml" xmlns:wp14="http://schemas.microsoft.com/office/word/2010/wordprocessingDrawing" xmlns:wp="http://schemas.openxmlformats.org/drawingml/2006/wordprocessingDrawing" xmlns:w10="urn:schemas-microsoft-com:office:word" xmlns:w="http://schemas.openxmlformats.org/wordprocessingml/2006/main" xmlns:w14="http://schemas.microsoft.com/office/word/2010/wordml" xmlns:w15="http://schemas.microsoft.com/office/word/2012/wordml" xmlns:w16cex="http://schemas.microsoft.com/office/word/2018/wordml/cex" xmlns:w16cid="http://schemas.microsoft.com/office/word/2016/wordml/cid" xmlns:w16="http://schemas.microsoft.com/office/word/2018/wordml" xmlns:w16du="http://schemas.microsoft.com/office/word/2023/wordml/word16du" xmlns:w16sdtdh="http://schemas.microsoft.com/office/word/2020/wordml/sdtdatahash" xmlns:w16sdtfl="http://schemas.microsoft.com/office/word/2024/wordml/sdtformatlock" xmlns:w16se="http://schemas.microsoft.com/office/word/2015/wordml/symex" xmlns:wpg="http://schemas.microsoft.com/office/word/2010/wordprocessingGroup" xmlns:wpi="http://schemas.microsoft.com/office/word/2010/wordprocessingInk" xmlns:wne="http://schemas.microsoft.com/office/word/2006/wordml" xmlns:wps="http://schemas.microsoft.com/office/word/2010/wordprocessingShape" mc:Ignorable="w14 w15 w16se w16cid w16 w16cex w16sdtdh w16sdtfl w16du wp14">
-  <w:comment w:id="0" w:author="Brian Locke" w:date="2026-04-08T21:28:00Z" w:initials="BL">
+  <w:comment w:id="0" w:author="Brian Locke" w:date="2026-04-08T19:13:00Z" w:initials="BL">
     <w:p>
       <w:r>
         <w:rPr>
@@ -4914,45 +4644,11 @@
           <w:sz w:val="20"/>
           <w:szCs w:val="20"/>
         </w:rPr>
-        <w:t>TODO: make sure this is reconciled with new framings in the body of the manuscript</w:t>
+        <w:t>I chopped and shortened this quite a bit so I just accepted the section rather than track changes through</w:t>
       </w:r>
     </w:p>
   </w:comment>
-  <w:comment w:id="1" w:author="Brian Locke" w:date="2026-04-08T19:13:00Z" w:initials="BL">
-    <w:p>
-      <w:r>
-        <w:rPr>
-          <w:rStyle w:val="CommentReference"/>
-        </w:rPr>
-        <w:annotationRef/>
-      </w:r>
-      <w:r>
-        <w:rPr>
-          <w:sz w:val="20"/>
-          <w:szCs w:val="20"/>
-        </w:rPr>
-        <w:t>I chopped and shortened this quite a bit so I just accepted the section rather than track changes through</w:t>
-      </w:r>
-    </w:p>
-  </w:comment>
-  <w:comment w:id="2" w:author="Brian Locke" w:date="2026-04-08T18:35:00Z" w:initials="BL">
-    <w:p>
-      <w:r>
-        <w:rPr>
-          <w:rStyle w:val="CommentReference"/>
-        </w:rPr>
-        <w:annotationRef/>
-      </w:r>
-      <w:r>
-        <w:rPr>
-          <w:sz w:val="20"/>
-          <w:szCs w:val="20"/>
-        </w:rPr>
-        <w:t>citation</w:t>
-      </w:r>
-    </w:p>
-  </w:comment>
-  <w:comment w:id="3" w:author="Brian Locke" w:date="2026-04-08T20:39:00Z" w:initials="BL">
+  <w:comment w:id="1" w:author="Brian Locke" w:date="2026-04-08T20:39:00Z" w:initials="BL">
     <w:p>
       <w:r>
         <w:rPr>
@@ -4972,7 +4668,7 @@
       </w:hyperlink>
     </w:p>
   </w:comment>
-  <w:comment w:id="4" w:author="Brian Locke" w:date="2026-04-08T18:35:00Z" w:initials="BL">
+  <w:comment w:id="2" w:author="Brian Locke" w:date="2026-04-08T18:35:00Z" w:initials="BL">
     <w:p>
       <w:r>
         <w:rPr>
@@ -4992,7 +4688,7 @@
       </w:hyperlink>
     </w:p>
   </w:comment>
-  <w:comment w:id="5" w:author="Brian Locke" w:date="2026-04-08T20:40:00Z" w:initials="BL">
+  <w:comment w:id="3" w:author="Brian Locke" w:date="2026-04-08T20:40:00Z" w:initials="BL">
     <w:p>
       <w:r>
         <w:rPr>
@@ -5012,7 +4708,7 @@
       </w:hyperlink>
     </w:p>
   </w:comment>
-  <w:comment w:id="6" w:author="Brian Locke" w:date="2026-04-08T19:17:00Z" w:initials="BL">
+  <w:comment w:id="4" w:author="Brian Locke" w:date="2026-04-08T19:17:00Z" w:initials="BL">
     <w:p>
       <w:r>
         <w:rPr>
@@ -5025,28 +4721,45 @@
           <w:sz w:val="20"/>
           <w:szCs w:val="20"/>
         </w:rPr>
-        <w:t>can cite my paper in CHEST and Nowbar</w:t>
-      </w:r>
-    </w:p>
-  </w:comment>
-  <w:comment w:id="7" w:author="Brian Locke" w:date="2026-04-08T20:49:00Z" w:initials="BL">
-    <w:p>
-      <w:r>
-        <w:rPr>
-          <w:rStyle w:val="CommentReference"/>
-        </w:rPr>
-        <w:annotationRef/>
-      </w:r>
+        <w:t xml:space="preserve">can cite my paper in CHEST  </w:t>
+      </w:r>
+      <w:hyperlink r:id="rId4" w:history="1">
+        <w:r>
+          <w:rPr>
+            <w:rStyle w:val="Hyperlink"/>
+            <w:sz w:val="20"/>
+            <w:szCs w:val="20"/>
+          </w:rPr>
+          <w:t>https://pmc.ncbi.nlm.nih.gov/articles/PMC12739763/</w:t>
+        </w:r>
+      </w:hyperlink>
       <w:r>
         <w:rPr>
           <w:sz w:val="20"/>
           <w:szCs w:val="20"/>
         </w:rPr>
+        <w:t xml:space="preserve"> and Nowbar - Nowbar S, Burkart KM, Gonzales R, et al. Obesity-associated hypoventilation in hospitalized patients: prevalence, effects, and outcome. Am J Med. Published online 2004. doi: 10.1016/j.amjmed.2003.08.022 [DOI] [Google Scholar]</w:t>
+      </w:r>
+    </w:p>
+  </w:comment>
+  <w:comment w:id="5" w:author="Brian Locke" w:date="2026-04-08T20:49:00Z" w:initials="BL">
+    <w:p>
+      <w:r>
+        <w:rPr>
+          <w:rStyle w:val="CommentReference"/>
+        </w:rPr>
+        <w:annotationRef/>
+      </w:r>
+      <w:r>
+        <w:rPr>
+          <w:sz w:val="20"/>
+          <w:szCs w:val="20"/>
+        </w:rPr>
         <w:t>citation for current use: ****</w:t>
       </w:r>
     </w:p>
   </w:comment>
-  <w:comment w:id="8" w:author="Brian Locke" w:date="2026-04-09T11:21:00Z" w:initials="BL">
+  <w:comment w:id="6" w:author="Brian Locke" w:date="2026-04-09T11:21:00Z" w:initials="BL">
     <w:p>
       <w:r>
         <w:rPr>
@@ -5054,7 +4767,7 @@
         </w:rPr>
         <w:annotationRef/>
       </w:r>
-      <w:hyperlink r:id="rId4" w:history="1">
+      <w:hyperlink r:id="rId5" w:history="1">
         <w:r>
           <w:rPr>
             <w:rStyle w:val="Hyperlink"/>
@@ -5066,7 +4779,7 @@
       </w:hyperlink>
     </w:p>
   </w:comment>
-  <w:comment w:id="9" w:author="Brian Locke" w:date="2026-04-09T12:11:00Z" w:initials="BL">
+  <w:comment w:id="7" w:author="Brian Locke" w:date="2026-04-09T12:11:00Z" w:initials="BL">
     <w:p>
       <w:r>
         <w:rPr>
@@ -5083,7 +4796,7 @@
       </w:r>
     </w:p>
   </w:comment>
-  <w:comment w:id="10" w:author="Brian Locke" w:date="2026-04-08T19:18:00Z" w:initials="BL">
+  <w:comment w:id="8" w:author="Brian Locke" w:date="2026-04-08T19:18:00Z" w:initials="BL">
     <w:p>
       <w:r>
         <w:rPr>
@@ -5135,7 +4848,7 @@
       </w:r>
     </w:p>
   </w:comment>
-  <w:comment w:id="11" w:author="Brian Locke" w:date="2026-04-08T19:18:00Z" w:initials="BL">
+  <w:comment w:id="9" w:author="Brian Locke" w:date="2026-04-08T19:18:00Z" w:initials="BL">
     <w:p>
       <w:r>
         <w:rPr>
@@ -5152,7 +4865,7 @@
       </w:r>
     </w:p>
   </w:comment>
-  <w:comment w:id="12" w:author="Brian Locke" w:date="2026-04-08T19:18:00Z" w:initials="BL">
+  <w:comment w:id="10" w:author="Brian Locke" w:date="2026-04-08T19:18:00Z" w:initials="BL">
     <w:p>
       <w:r>
         <w:rPr>
@@ -5169,7 +4882,7 @@
       </w:r>
     </w:p>
   </w:comment>
-  <w:comment w:id="13" w:author="Brian Locke" w:date="2026-04-09T12:11:00Z" w:initials="BL">
+  <w:comment w:id="11" w:author="Brian Locke" w:date="2026-04-09T12:11:00Z" w:initials="BL">
     <w:p>
       <w:r>
         <w:rPr>
@@ -5186,7 +4899,7 @@
       </w:r>
     </w:p>
   </w:comment>
-  <w:comment w:id="14" w:author="Brian Locke" w:date="2026-04-08T19:19:00Z" w:initials="BL">
+  <w:comment w:id="12" w:author="Brian Locke" w:date="2026-04-08T19:19:00Z" w:initials="BL">
     <w:p>
       <w:r>
         <w:rPr>
@@ -5255,7 +4968,7 @@
       </w:r>
     </w:p>
   </w:comment>
-  <w:comment w:id="15" w:author="Brian Locke" w:date="2026-04-09T12:10:00Z" w:initials="BL">
+  <w:comment w:id="13" w:author="Brian Locke" w:date="2026-04-09T12:10:00Z" w:initials="BL">
     <w:p>
       <w:r>
         <w:rPr>
@@ -5292,7 +5005,7 @@
       </w:r>
     </w:p>
   </w:comment>
-  <w:comment w:id="16" w:author="Brian Locke" w:date="2026-04-08T19:19:00Z" w:initials="BL">
+  <w:comment w:id="14" w:author="Brian Locke" w:date="2026-04-08T19:19:00Z" w:initials="BL">
     <w:p>
       <w:r>
         <w:rPr>
@@ -5327,7 +5040,7 @@
       </w:r>
     </w:p>
   </w:comment>
-  <w:comment w:id="17" w:author="Brian Locke" w:date="2026-04-09T12:08:00Z" w:initials="BL">
+  <w:comment w:id="15" w:author="Brian Locke" w:date="2026-04-09T12:08:00Z" w:initials="BL">
     <w:p>
       <w:r>
         <w:rPr>
@@ -5344,7 +5057,7 @@
       </w:r>
     </w:p>
   </w:comment>
-  <w:comment w:id="18" w:author="Brian Locke" w:date="2026-04-09T12:09:00Z" w:initials="BL">
+  <w:comment w:id="16" w:author="Brian Locke" w:date="2026-04-09T12:09:00Z" w:initials="BL">
     <w:p>
       <w:r>
         <w:rPr>
@@ -5361,7 +5074,7 @@
       </w:r>
     </w:p>
   </w:comment>
-  <w:comment w:id="19" w:author="Brian Locke" w:date="2026-04-09T11:14:00Z" w:initials="BL">
+  <w:comment w:id="17" w:author="Brian Locke" w:date="2026-04-09T11:14:00Z" w:initials="BL">
     <w:p>
       <w:r>
         <w:rPr>
@@ -5369,7 +5082,7 @@
         </w:rPr>
         <w:annotationRef/>
       </w:r>
-      <w:hyperlink r:id="rId5" w:history="1">
+      <w:hyperlink r:id="rId6" w:history="1">
         <w:r>
           <w:rPr>
             <w:rStyle w:val="Hyperlink"/>
@@ -5388,7 +5101,7 @@
       </w:r>
     </w:p>
   </w:comment>
-  <w:comment w:id="20" w:author="Brian Locke" w:date="2026-04-09T12:12:00Z" w:initials="BL">
+  <w:comment w:id="18" w:author="Brian Locke" w:date="2026-04-09T12:12:00Z" w:initials="BL">
     <w:p>
       <w:r>
         <w:rPr>
@@ -5405,7 +5118,7 @@
       </w:r>
     </w:p>
   </w:comment>
-  <w:comment w:id="21" w:author="Brian Locke" w:date="2026-04-08T22:14:00Z" w:initials="BL">
+  <w:comment w:id="19" w:author="Brian Locke" w:date="2026-04-08T22:14:00Z" w:initials="BL">
     <w:p>
       <w:r>
         <w:rPr>
@@ -5418,7 +5131,7 @@
           <w:sz w:val="20"/>
           <w:szCs w:val="20"/>
         </w:rPr>
-        <w:t>2. Decide whether repeated encounters need analytic handling</w:t>
+        <w:t>Decide whether repeated encounters need analytic handling</w:t>
       </w:r>
     </w:p>
     <w:p/>
@@ -5428,7 +5141,7 @@
           <w:sz w:val="20"/>
           <w:szCs w:val="20"/>
         </w:rPr>
-        <w:t>You now state that patients could contribute multiple eligible encounters. That is good. But it raises the next question: were encounters treated as independent, or did you account for within-patient correlation?</w:t>
+        <w:t>Should we account for within-patient correlation?</w:t>
       </w:r>
     </w:p>
     <w:p/>
@@ -5438,17 +5151,16 @@
           <w:sz w:val="20"/>
           <w:szCs w:val="20"/>
         </w:rPr>
-        <w:t>If the code does not cluster standard errors by patient, a reviewer may ask about this. At minimum, decide whether to:</w:t>
-      </w:r>
-    </w:p>
-    <w:p/>
+        <w:t>justify encounter-level independence,</w:t>
+      </w:r>
+    </w:p>
     <w:p>
       <w:r>
         <w:rPr>
           <w:sz w:val="20"/>
           <w:szCs w:val="20"/>
         </w:rPr>
-        <w:t>justify encounter-level independence,</w:t>
+        <w:t>use cluster-robust standard errors if possible,</w:t>
       </w:r>
     </w:p>
     <w:p>
@@ -5457,30 +5169,55 @@
           <w:sz w:val="20"/>
           <w:szCs w:val="20"/>
         </w:rPr>
-        <w:t>use cluster-robust standard errors if possible,</w:t>
-      </w:r>
-    </w:p>
-    <w:p>
-      <w:r>
-        <w:rPr>
+        <w:t>or add a sensitivity analysis restricted to the first eligible encounter per patient.</w:t>
+      </w:r>
+    </w:p>
+  </w:comment>
+  <w:comment w:id="20" w:author="Brian Locke" w:date="2026-04-09T14:34:00Z" w:initials="BL">
+    <w:p>
+      <w:r>
+        <w:rPr>
+          <w:rStyle w:val="CommentReference"/>
+        </w:rPr>
+        <w:annotationRef/>
+      </w:r>
+      <w:r>
+        <w:rPr>
+          <w:b/>
+          <w:bCs/>
           <w:sz w:val="20"/>
           <w:szCs w:val="20"/>
         </w:rPr>
-        <w:t>or add a sensitivity analysis restricted to the first eligible encounter per patient.</w:t>
-      </w:r>
-    </w:p>
-    <w:p/>
+        <w:t>Multiple encounters per patient</w:t>
+      </w:r>
+    </w:p>
     <w:p>
       <w:r>
         <w:rPr>
           <w:sz w:val="20"/>
           <w:szCs w:val="20"/>
         </w:rPr>
-        <w:t>This is not just wording. It is the main remaining design issue.</w:t>
+        <w:t xml:space="preserve">Patients could contribute multiple eligible encounters, but the current methods do not explicitly say how ywe handled </w:t>
+      </w:r>
+      <w:r>
+        <w:rPr>
+          <w:b/>
+          <w:bCs/>
+          <w:sz w:val="20"/>
+          <w:szCs w:val="20"/>
+        </w:rPr>
+        <w:t>within-patient correlation</w:t>
+      </w:r>
+      <w:r>
+        <w:rPr>
+          <w:sz w:val="20"/>
+          <w:szCs w:val="20"/>
+        </w:rPr>
+        <w:t>. Reviewers may ask for cluster-robust standard errors, GEE, or multilevel models. Liang &amp; Zeger is the foundational GEE citation; Cameron &amp; Miller is a practical reference for cluster-robust inference.</w:t>
       </w:r>
     </w:p>
   </w:comment>
-  <w:comment w:id="22" w:author="Brian Locke" w:date="2026-04-08T21:04:00Z" w:initials="BL">
+  <w:comment w:id="21" w:author="Brian Locke" w:date="2026-04-08T21:04:00Z" w:initials="BL">
     <w:p>
       <w:r>
         <w:rPr>
@@ -5494,12 +5231,12 @@
           <w:sz w:val="20"/>
           <w:szCs w:val="20"/>
         </w:rPr>
-        <w:t>LOINC codes 2019-8, 2026-3, and 32771-8 ); venous samples were identified using LOINC codes 115577-6 and 2021-4.</w:t>
+        <w:t>LOINC codes 2019-8, 2026-3, and 32771-8 ); venous samples were identified using LOINC codes 115577-6 and 2021-4.6.92.  - maybe we just make sure these are in the supplement?</w:t>
       </w:r>
     </w:p>
     <w:p/>
   </w:comment>
-  <w:comment w:id="23" w:author="Brian Locke" w:date="2026-04-08T21:05:00Z" w:initials="BL">
+  <w:comment w:id="22" w:author="Brian Locke" w:date="2026-04-08T21:05:00Z" w:initials="BL">
     <w:p>
       <w:r>
         <w:rPr>
@@ -5515,9 +5252,16 @@
         </w:rPr>
         <w:t xml:space="preserve">ICD-10-CM codes E66.2, J96.02, J96.12, J96.22, and J96.92. </w:t>
       </w:r>
+      <w:r>
+        <w:rPr>
+          <w:sz w:val="20"/>
+          <w:szCs w:val="20"/>
+        </w:rPr>
+        <w:t xml:space="preserve"> - maybe we just make sure these are in the supplement?</w:t>
+      </w:r>
     </w:p>
   </w:comment>
-  <w:comment w:id="24" w:author="Brian Locke" w:date="2026-04-09T11:23:00Z" w:initials="BL">
+  <w:comment w:id="23" w:author="Brian Locke" w:date="2026-04-09T11:23:00Z" w:initials="BL">
     <w:p>
       <w:r>
         <w:rPr>
@@ -5525,7 +5269,7 @@
         </w:rPr>
         <w:annotationRef/>
       </w:r>
-      <w:hyperlink r:id="rId6" w:history="1">
+      <w:hyperlink r:id="rId7" w:history="1">
         <w:r>
           <w:rPr>
             <w:rStyle w:val="Hyperlink"/>
@@ -5538,7 +5282,7 @@
     </w:p>
     <w:p/>
   </w:comment>
-  <w:comment w:id="25" w:author="Brian Locke" w:date="2026-04-09T11:21:00Z" w:initials="BL">
+  <w:comment w:id="24" w:author="Brian Locke" w:date="2026-04-09T11:21:00Z" w:initials="BL">
     <w:p>
       <w:r>
         <w:rPr>
@@ -5546,7 +5290,7 @@
         </w:rPr>
         <w:annotationRef/>
       </w:r>
-      <w:hyperlink r:id="rId7" w:history="1">
+      <w:hyperlink r:id="rId8" w:history="1">
         <w:r>
           <w:rPr>
             <w:rStyle w:val="Hyperlink"/>
@@ -5558,7 +5302,7 @@
       </w:hyperlink>
     </w:p>
   </w:comment>
-  <w:comment w:id="26" w:author="Brian Locke" w:date="2026-04-09T11:04:00Z" w:initials="BL">
+  <w:comment w:id="25" w:author="Brian Locke" w:date="2026-04-09T11:04:00Z" w:initials="BL">
     <w:p>
       <w:r>
         <w:rPr>
@@ -5566,7 +5310,7 @@
         </w:rPr>
         <w:annotationRef/>
       </w:r>
-      <w:hyperlink r:id="rId8" w:history="1">
+      <w:hyperlink r:id="rId9" w:history="1">
         <w:r>
           <w:rPr>
             <w:rStyle w:val="Hyperlink"/>
@@ -5578,7 +5322,7 @@
       </w:hyperlink>
     </w:p>
   </w:comment>
-  <w:comment w:id="27" w:author="Brian Locke" w:date="2026-04-09T11:11:00Z" w:initials="BL">
+  <w:comment w:id="26" w:author="Brian Locke" w:date="2026-04-09T11:11:00Z" w:initials="BL">
     <w:p>
       <w:r>
         <w:rPr>
@@ -5586,7 +5330,7 @@
         </w:rPr>
         <w:annotationRef/>
       </w:r>
-      <w:hyperlink r:id="rId9" w:history="1">
+      <w:hyperlink r:id="rId10" w:history="1">
         <w:r>
           <w:rPr>
             <w:rStyle w:val="Hyperlink"/>
@@ -5598,7 +5342,7 @@
       </w:hyperlink>
     </w:p>
   </w:comment>
-  <w:comment w:id="28" w:author="Brian Locke" w:date="2026-04-09T10:55:00Z" w:initials="BL">
+  <w:comment w:id="27" w:author="Brian Locke" w:date="2026-04-09T10:55:00Z" w:initials="BL">
     <w:p>
       <w:r>
         <w:rPr>
@@ -5606,7 +5350,7 @@
         </w:rPr>
         <w:annotationRef/>
       </w:r>
-      <w:hyperlink r:id="rId10" w:history="1">
+      <w:hyperlink r:id="rId11" w:history="1">
         <w:r>
           <w:rPr>
             <w:rStyle w:val="Hyperlink"/>
@@ -5618,7 +5362,7 @@
       </w:hyperlink>
     </w:p>
   </w:comment>
-  <w:comment w:id="29" w:author="Brian Locke" w:date="2026-04-08T21:26:00Z" w:initials="BL">
+  <w:comment w:id="28" w:author="Brian Locke" w:date="2026-04-08T21:26:00Z" w:initials="BL">
     <w:p>
       <w:r>
         <w:rPr>
@@ -5633,7 +5377,7 @@
         </w:rPr>
         <w:t xml:space="preserve">citation for this </w:t>
       </w:r>
-      <w:hyperlink r:id="rId11" w:history="1">
+      <w:hyperlink r:id="rId12" w:history="1">
         <w:r>
           <w:rPr>
             <w:rStyle w:val="Hyperlink"/>
@@ -5650,7 +5394,7 @@
         </w:rPr>
         <w:t xml:space="preserve"> and </w:t>
       </w:r>
-      <w:hyperlink r:id="rId12" w:history="1">
+      <w:hyperlink r:id="rId13" w:history="1">
         <w:r>
           <w:rPr>
             <w:rStyle w:val="Hyperlink"/>
@@ -5662,7 +5406,7 @@
       </w:hyperlink>
     </w:p>
   </w:comment>
-  <w:comment w:id="30" w:author="Brian Locke" w:date="2026-04-08T22:28:00Z" w:initials="BL">
+  <w:comment w:id="29" w:author="Brian Locke" w:date="2026-04-08T22:28:00Z" w:initials="BL">
     <w:p>
       <w:r>
         <w:rPr>
@@ -5675,11 +5419,11 @@
           <w:sz w:val="20"/>
           <w:szCs w:val="20"/>
         </w:rPr>
-        <w:t>windsorized</w:t>
+        <w:t>IS windsorized a better term? I'm actually not sure</w:t>
       </w:r>
     </w:p>
   </w:comment>
-  <w:comment w:id="31" w:author="Brian Locke" w:date="2026-04-09T10:52:00Z" w:initials="BL">
+  <w:comment w:id="30" w:author="Brian Locke" w:date="2026-04-09T10:52:00Z" w:initials="BL">
     <w:p>
       <w:r>
         <w:rPr>
@@ -5694,7 +5438,7 @@
         </w:rPr>
         <w:t xml:space="preserve">citation: </w:t>
       </w:r>
-      <w:hyperlink r:id="rId13" w:history="1">
+      <w:hyperlink r:id="rId14" w:history="1">
         <w:r>
           <w:rPr>
             <w:rStyle w:val="Hyperlink"/>
@@ -5706,7 +5450,7 @@
       </w:hyperlink>
     </w:p>
   </w:comment>
-  <w:comment w:id="32" w:author="Brian Locke" w:date="2026-04-09T11:12:00Z" w:initials="BL">
+  <w:comment w:id="31" w:author="Brian Locke" w:date="2026-04-09T11:12:00Z" w:initials="BL">
     <w:p>
       <w:r>
         <w:rPr>
@@ -5721,7 +5465,7 @@
         </w:rPr>
         <w:t xml:space="preserve">also </w:t>
       </w:r>
-      <w:hyperlink r:id="rId14" w:history="1">
+      <w:hyperlink r:id="rId15" w:history="1">
         <w:r>
           <w:rPr>
             <w:rStyle w:val="Hyperlink"/>
@@ -5733,7 +5477,7 @@
       </w:hyperlink>
     </w:p>
   </w:comment>
-  <w:comment w:id="33" w:author="Brian Locke" w:date="2026-04-09T10:56:00Z" w:initials="BL">
+  <w:comment w:id="32" w:author="Brian Locke" w:date="2026-04-09T10:56:00Z" w:initials="BL">
     <w:p>
       <w:r>
         <w:rPr>
@@ -5741,7 +5485,7 @@
         </w:rPr>
         <w:annotationRef/>
       </w:r>
-      <w:hyperlink r:id="rId15" w:history="1">
+      <w:hyperlink r:id="rId16" w:history="1">
         <w:r>
           <w:rPr>
             <w:rStyle w:val="Hyperlink"/>
@@ -5753,7 +5497,7 @@
       </w:hyperlink>
     </w:p>
   </w:comment>
-  <w:comment w:id="34" w:author="Brian Locke" w:date="2026-04-09T09:25:00Z" w:initials="BL">
+  <w:comment w:id="33" w:author="Brian Locke" w:date="2026-04-09T10:57:00Z" w:initials="BL">
     <w:p>
       <w:r>
         <w:rPr>
@@ -5761,52 +5505,7 @@
         </w:rPr>
         <w:annotationRef/>
       </w:r>
-      <w:r>
-        <w:rPr>
-          <w:sz w:val="20"/>
-          <w:szCs w:val="20"/>
-        </w:rPr>
-        <w:t>[ ] TODO: If Figure 2 will include both OR and predicted-probability panels, make sure the Methods now state:</w:t>
-      </w:r>
-    </w:p>
-    <w:p/>
-    <w:p>
-      <w:r>
-        <w:rPr>
-          <w:sz w:val="20"/>
-          <w:szCs w:val="20"/>
-        </w:rPr>
-        <w:t>how the predicted probabilities were generated,</w:t>
-      </w:r>
-    </w:p>
-    <w:p>
-      <w:r>
-        <w:rPr>
-          <w:sz w:val="20"/>
-          <w:szCs w:val="20"/>
-        </w:rPr>
-        <w:t>what covariates were held constant or how averaging was done,</w:t>
-      </w:r>
-    </w:p>
-    <w:p>
-      <w:r>
-        <w:rPr>
-          <w:sz w:val="20"/>
-          <w:szCs w:val="20"/>
-        </w:rPr>
-        <w:t>and that these were from the weighted primary models.</w:t>
-      </w:r>
-    </w:p>
-  </w:comment>
-  <w:comment w:id="35" w:author="Brian Locke" w:date="2026-04-09T10:57:00Z" w:initials="BL">
-    <w:p>
-      <w:r>
-        <w:rPr>
-          <w:rStyle w:val="CommentReference"/>
-        </w:rPr>
-        <w:annotationRef/>
-      </w:r>
-      <w:hyperlink r:id="rId16" w:history="1">
+      <w:hyperlink r:id="rId17" w:history="1">
         <w:r>
           <w:rPr>
             <w:rStyle w:val="Hyperlink"/>
@@ -5818,7 +5517,7 @@
       </w:hyperlink>
     </w:p>
   </w:comment>
-  <w:comment w:id="36" w:author="Brian Locke" w:date="2026-04-09T10:58:00Z" w:initials="BL">
+  <w:comment w:id="34" w:author="Brian Locke" w:date="2026-04-09T10:58:00Z" w:initials="BL">
     <w:p>
       <w:r>
         <w:rPr>
@@ -5826,7 +5525,7 @@
         </w:rPr>
         <w:annotationRef/>
       </w:r>
-      <w:hyperlink r:id="rId17" w:history="1">
+      <w:hyperlink r:id="rId18" w:history="1">
         <w:r>
           <w:rPr>
             <w:rStyle w:val="Hyperlink"/>
@@ -5838,7 +5537,7 @@
       </w:hyperlink>
     </w:p>
   </w:comment>
-  <w:comment w:id="37" w:author="Brian Locke" w:date="2026-04-09T11:13:00Z" w:initials="BL">
+  <w:comment w:id="35" w:author="Brian Locke" w:date="2026-04-09T11:13:00Z" w:initials="BL">
     <w:p>
       <w:r>
         <w:rPr>
@@ -5853,7 +5552,7 @@
         </w:rPr>
         <w:t xml:space="preserve">also </w:t>
       </w:r>
-      <w:hyperlink r:id="rId18" w:history="1">
+      <w:hyperlink r:id="rId19" w:history="1">
         <w:r>
           <w:rPr>
             <w:rStyle w:val="Hyperlink"/>
@@ -5865,7 +5564,7 @@
       </w:hyperlink>
     </w:p>
   </w:comment>
-  <w:comment w:id="38" w:author="Brian Locke" w:date="2026-04-09T10:59:00Z" w:initials="BL">
+  <w:comment w:id="36" w:author="Brian Locke" w:date="2026-04-09T10:59:00Z" w:initials="BL">
     <w:p>
       <w:r>
         <w:rPr>
@@ -5873,7 +5572,7 @@
         </w:rPr>
         <w:annotationRef/>
       </w:r>
-      <w:hyperlink r:id="rId19" w:history="1">
+      <w:hyperlink r:id="rId20" w:history="1">
         <w:r>
           <w:rPr>
             <w:rStyle w:val="Hyperlink"/>
@@ -5885,7 +5584,7 @@
       </w:hyperlink>
     </w:p>
   </w:comment>
-  <w:comment w:id="39" w:author="Brian Locke" w:date="2026-04-09T10:58:00Z" w:initials="BL">
+  <w:comment w:id="37" w:author="Brian Locke" w:date="2026-04-09T10:58:00Z" w:initials="BL">
     <w:p>
       <w:r>
         <w:rPr>
@@ -5893,7 +5592,7 @@
         </w:rPr>
         <w:annotationRef/>
       </w:r>
-      <w:hyperlink r:id="rId20" w:history="1">
+      <w:hyperlink r:id="rId21" w:history="1">
         <w:r>
           <w:rPr>
             <w:rStyle w:val="Hyperlink"/>
@@ -5905,7 +5604,7 @@
       </w:hyperlink>
     </w:p>
   </w:comment>
-  <w:comment w:id="41" w:author="Brian Locke" w:date="2026-04-09T09:27:00Z" w:initials="BL">
+  <w:comment w:id="39" w:author="Brian Locke" w:date="2026-04-09T09:27:00Z" w:initials="BL">
     <w:p>
       <w:r>
         <w:rPr>
@@ -5922,7 +5621,7 @@
       </w:r>
     </w:p>
   </w:comment>
-  <w:comment w:id="42" w:author="Brian Locke" w:date="2026-04-09T06:40:00Z" w:initials="BL">
+  <w:comment w:id="40" w:author="Brian Locke" w:date="2026-04-09T06:40:00Z" w:initials="BL">
     <w:p>
       <w:r>
         <w:rPr>
@@ -6002,7 +5701,7 @@
       </w:r>
     </w:p>
   </w:comment>
-  <w:comment w:id="43" w:author="Brian Locke" w:date="2026-04-09T06:41:00Z" w:initials="BL">
+  <w:comment w:id="41" w:author="Brian Locke" w:date="2026-04-09T06:41:00Z" w:initials="BL">
     <w:p>
       <w:r>
         <w:rPr>
@@ -6064,7 +5763,7 @@
       </w:r>
     </w:p>
   </w:comment>
-  <w:comment w:id="44" w:author="Brian Locke" w:date="2026-04-09T06:43:00Z" w:initials="BL">
+  <w:comment w:id="42" w:author="Brian Locke" w:date="2026-04-09T06:43:00Z" w:initials="BL">
     <w:p>
       <w:r>
         <w:rPr>
@@ -6127,7 +5826,7 @@
     </w:p>
     <w:p/>
   </w:comment>
-  <w:comment w:id="45" w:author="Brian Locke" w:date="2026-04-09T06:56:00Z" w:initials="BL">
+  <w:comment w:id="43" w:author="Brian Locke" w:date="2026-04-09T06:56:00Z" w:initials="BL">
     <w:p>
       <w:r>
         <w:rPr>
@@ -6156,7 +5855,7 @@
     </w:p>
     <w:p/>
   </w:comment>
-  <w:comment w:id="46" w:author="Brian Locke" w:date="2026-04-09T06:57:00Z" w:initials="BL">
+  <w:comment w:id="44" w:author="Brian Locke" w:date="2026-04-09T06:57:00Z" w:initials="BL">
     <w:p>
       <w:r>
         <w:rPr>
@@ -6195,7 +5894,7 @@
     </w:p>
     <w:p/>
   </w:comment>
-  <w:comment w:id="47" w:author="Brian Locke" w:date="2026-04-09T12:35:00Z" w:initials="BL">
+  <w:comment w:id="45" w:author="Brian Locke" w:date="2026-04-09T12:35:00Z" w:initials="BL">
     <w:p>
       <w:r>
         <w:rPr>
@@ -6210,7 +5909,7 @@
         </w:rPr>
         <w:t xml:space="preserve">Davies - </w:t>
       </w:r>
-      <w:hyperlink r:id="rId21" w:history="1">
+      <w:hyperlink r:id="rId22" w:history="1">
         <w:r>
           <w:rPr>
             <w:rStyle w:val="Hyperlink"/>
@@ -6222,7 +5921,7 @@
       </w:hyperlink>
     </w:p>
   </w:comment>
-  <w:comment w:id="48" w:author="Brian Locke" w:date="2026-04-09T12:34:00Z" w:initials="BL">
+  <w:comment w:id="46" w:author="Brian Locke" w:date="2026-04-09T12:34:00Z" w:initials="BL">
     <w:p>
       <w:r>
         <w:rPr>
@@ -6237,7 +5936,7 @@
         </w:rPr>
         <w:t xml:space="preserve">Weimer - </w:t>
       </w:r>
-      <w:hyperlink r:id="rId22" w:history="1">
+      <w:hyperlink r:id="rId23" w:history="1">
         <w:r>
           <w:rPr>
             <w:rStyle w:val="Hyperlink"/>
@@ -6249,7 +5948,7 @@
       </w:hyperlink>
     </w:p>
   </w:comment>
-  <w:comment w:id="49" w:author="Brian Locke" w:date="2026-04-09T12:31:00Z" w:initials="BL">
+  <w:comment w:id="47" w:author="Brian Locke" w:date="2026-04-09T12:31:00Z" w:initials="BL">
     <w:p>
       <w:r>
         <w:rPr>
@@ -6257,7 +5956,7 @@
         </w:rPr>
         <w:annotationRef/>
       </w:r>
-      <w:hyperlink r:id="rId23" w:history="1">
+      <w:hyperlink r:id="rId24" w:history="1">
         <w:r>
           <w:rPr>
             <w:rStyle w:val="Hyperlink"/>
@@ -6269,7 +5968,7 @@
       </w:hyperlink>
     </w:p>
   </w:comment>
-  <w:comment w:id="50" w:author="Brian Locke" w:date="2025-09-22T16:03:00Z" w:initials="BL">
+  <w:comment w:id="48" w:author="Brian Locke" w:date="2025-09-22T16:03:00Z" w:initials="BL">
     <w:p>
       <w:r>
         <w:rPr>
@@ -6284,7 +5983,7 @@
         </w:rPr>
         <w:t xml:space="preserve">Have you used Zotero before? I think that's the best option. If you want to start put together references, feel free to put them in here: </w:t>
       </w:r>
-      <w:hyperlink r:id="rId24" w:history="1">
+      <w:hyperlink r:id="rId25" w:history="1">
         <w:r>
           <w:rPr>
             <w:rStyle w:val="Hyperlink"/>
@@ -6312,31 +6011,12 @@
       </w:r>
     </w:p>
   </w:comment>
-  <w:comment w:id="51" w:author="Brian Locke" w:date="2025-11-12T10:44:00Z" w:initials="BL">
-    <w:p>
-      <w:r>
-        <w:rPr>
-          <w:rStyle w:val="CommentReference"/>
-        </w:rPr>
-        <w:annotationRef/>
-      </w:r>
-      <w:r>
-        <w:rPr>
-          <w:sz w:val="20"/>
-          <w:szCs w:val="20"/>
-        </w:rPr>
-        <w:t>STROBE and RECORD checklists completed and uploaded; code lists and propensity diagnostics</w:t>
-      </w:r>
-    </w:p>
-  </w:comment>
 </w:comments>
 </file>
 
 <file path=word/commentsExtended.xml><?xml version="1.0" encoding="utf-8"?>
 <w15:commentsEx xmlns:wpc="http://schemas.microsoft.com/office/word/2010/wordprocessingCanvas" xmlns:cx="http://schemas.microsoft.com/office/drawing/2014/chartex" xmlns:cx1="http://schemas.microsoft.com/office/drawing/2015/9/8/chartex" xmlns:cx2="http://schemas.microsoft.com/office/drawing/2015/10/21/chartex" xmlns:cx3="http://schemas.microsoft.com/office/drawing/2016/5/9/chartex" xmlns:cx4="http://schemas.microsoft.com/office/drawing/2016/5/10/chartex" xmlns:cx5="http://schemas.microsoft.com/office/drawing/2016/5/11/chartex" xmlns:cx6="http://schemas.microsoft.com/office/drawing/2016/5/12/chartex" xmlns:cx7="http://schemas.microsoft.com/office/drawing/2016/5/13/chartex" xmlns:cx8="http://schemas.microsoft.com/office/drawing/2016/5/14/chartex" xmlns:mc="http://schemas.openxmlformats.org/markup-compatibility/2006" xmlns:aink="http://schemas.microsoft.com/office/drawing/2016/ink" xmlns:am3d="http://schemas.microsoft.com/office/drawing/2017/model3d" xmlns:o="urn:schemas-microsoft-com:office:office" xmlns:oel="http://schemas.microsoft.com/office/2019/extlst" xmlns:r="http://schemas.openxmlformats.org/officeDocument/2006/relationships" xmlns:m="http://schemas.openxmlformats.org/officeDocument/2006/math" xmlns:v="urn:schemas-microsoft-com:vml" xmlns:wp14="http://schemas.microsoft.com/office/word/2010/wordprocessingDrawing" xmlns:wp="http://schemas.openxmlformats.org/drawingml/2006/wordprocessingDrawing" xmlns:w10="urn:schemas-microsoft-com:office:word" xmlns:w="http://schemas.openxmlformats.org/wordprocessingml/2006/main" xmlns:w14="http://schemas.microsoft.com/office/word/2010/wordml" xmlns:w15="http://schemas.microsoft.com/office/word/2012/wordml" xmlns:w16cex="http://schemas.microsoft.com/office/word/2018/wordml/cex" xmlns:w16cid="http://schemas.microsoft.com/office/word/2016/wordml/cid" xmlns:w16="http://schemas.microsoft.com/office/word/2018/wordml" xmlns:w16du="http://schemas.microsoft.com/office/word/2023/wordml/word16du" xmlns:w16sdtdh="http://schemas.microsoft.com/office/word/2020/wordml/sdtdatahash" xmlns:w16sdtfl="http://schemas.microsoft.com/office/word/2024/wordml/sdtformatlock" xmlns:w16se="http://schemas.microsoft.com/office/word/2015/wordml/symex" xmlns:wpg="http://schemas.microsoft.com/office/word/2010/wordprocessingGroup" xmlns:wpi="http://schemas.microsoft.com/office/word/2010/wordprocessingInk" xmlns:wne="http://schemas.microsoft.com/office/word/2006/wordml" xmlns:wps="http://schemas.microsoft.com/office/word/2010/wordprocessingShape" mc:Ignorable="w14 w15 w16se w16cid w16 w16cex w16sdtdh w16sdtfl w16du wp14">
-  <w15:commentEx w15:paraId="6CB65538" w15:done="0"/>
   <w15:commentEx w15:paraId="7D26BAA3" w15:done="0"/>
-  <w15:commentEx w15:paraId="04A16901" w15:done="0"/>
   <w15:commentEx w15:paraId="29537397" w15:done="0"/>
   <w15:commentEx w15:paraId="6DF72313" w15:done="0"/>
   <w15:commentEx w15:paraId="4FE3898E" w15:paraIdParent="6DF72313" w15:done="0"/>
@@ -6356,6 +6036,7 @@
   <w15:commentEx w15:paraId="04AD913C" w15:done="0"/>
   <w15:commentEx w15:paraId="388F7A41" w15:done="0"/>
   <w15:commentEx w15:paraId="2DEAB2B8" w15:done="0"/>
+  <w15:commentEx w15:paraId="33E1C747" w15:paraIdParent="2DEAB2B8" w15:done="0"/>
   <w15:commentEx w15:paraId="5C5E9154" w15:done="0"/>
   <w15:commentEx w15:paraId="6BB1CEDA" w15:done="0"/>
   <w15:commentEx w15:paraId="70EC2118" w15:done="0"/>
@@ -6368,7 +6049,6 @@
   <w15:commentEx w15:paraId="3155EECE" w15:paraIdParent="5B730F48" w15:done="0"/>
   <w15:commentEx w15:paraId="5AE17C7A" w15:paraIdParent="5B730F48" w15:done="0"/>
   <w15:commentEx w15:paraId="45F76044" w15:done="0"/>
-  <w15:commentEx w15:paraId="1FEA7C0B" w15:done="0"/>
   <w15:commentEx w15:paraId="574923F3" w15:done="0"/>
   <w15:commentEx w15:paraId="44AE4710" w15:done="0"/>
   <w15:commentEx w15:paraId="17147733" w15:paraIdParent="44AE4710" w15:done="0"/>
@@ -6383,16 +6063,13 @@
   <w15:commentEx w15:paraId="603AE6D9" w15:done="0"/>
   <w15:commentEx w15:paraId="0EA73272" w15:done="0"/>
   <w15:commentEx w15:paraId="3CED7C0A" w15:done="0"/>
-  <w15:commentEx w15:paraId="56896536" w15:done="1"/>
-  <w15:commentEx w15:paraId="15626216" w15:done="0"/>
+  <w15:commentEx w15:paraId="56896536" w15:done="0"/>
 </w15:commentsEx>
 </file>
 
 <file path=word/commentsExtensible.xml><?xml version="1.0" encoding="utf-8"?>
 <w16cex:commentsExtensible xmlns:wpc="http://schemas.microsoft.com/office/word/2010/wordprocessingCanvas" xmlns:cx="http://schemas.microsoft.com/office/drawing/2014/chartex" xmlns:cx1="http://schemas.microsoft.com/office/drawing/2015/9/8/chartex" xmlns:cx2="http://schemas.microsoft.com/office/drawing/2015/10/21/chartex" xmlns:cx3="http://schemas.microsoft.com/office/drawing/2016/5/9/chartex" xmlns:cx4="http://schemas.microsoft.com/office/drawing/2016/5/10/chartex" xmlns:cx5="http://schemas.microsoft.com/office/drawing/2016/5/11/chartex" xmlns:cx6="http://schemas.microsoft.com/office/drawing/2016/5/12/chartex" xmlns:cx7="http://schemas.microsoft.com/office/drawing/2016/5/13/chartex" xmlns:cx8="http://schemas.microsoft.com/office/drawing/2016/5/14/chartex" xmlns:cr="http://schemas.microsoft.com/office/comments/2020/reactions" xmlns:mc="http://schemas.openxmlformats.org/markup-compatibility/2006" xmlns:aink="http://schemas.microsoft.com/office/drawing/2016/ink" xmlns:am3d="http://schemas.microsoft.com/office/drawing/2017/model3d" xmlns:o="urn:schemas-microsoft-com:office:office" xmlns:oel="http://schemas.microsoft.com/office/2019/extlst" xmlns:r="http://schemas.openxmlformats.org/officeDocument/2006/relationships" xmlns:m="http://schemas.openxmlformats.org/officeDocument/2006/math" xmlns:v="urn:schemas-microsoft-com:vml" xmlns:wp14="http://schemas.microsoft.com/office/word/2010/wordprocessingDrawing" xmlns:wp="http://schemas.openxmlformats.org/drawingml/2006/wordprocessingDrawing" xmlns:w10="urn:schemas-microsoft-com:office:word" xmlns:w="http://schemas.openxmlformats.org/wordprocessingml/2006/main" xmlns:w14="http://schemas.microsoft.com/office/word/2010/wordml" xmlns:w15="http://schemas.microsoft.com/office/word/2012/wordml" xmlns:w16cex="http://schemas.microsoft.com/office/word/2018/wordml/cex" xmlns:w16cid="http://schemas.microsoft.com/office/word/2016/wordml/cid" xmlns:w16="http://schemas.microsoft.com/office/word/2018/wordml" xmlns:w16du="http://schemas.microsoft.com/office/word/2023/wordml/word16du" xmlns:w16sdtdh="http://schemas.microsoft.com/office/word/2020/wordml/sdtdatahash" xmlns:w16sdtfl="http://schemas.microsoft.com/office/word/2024/wordml/sdtformatlock" xmlns:w16se="http://schemas.microsoft.com/office/word/2015/wordml/symex" xmlns:wpg="http://schemas.microsoft.com/office/word/2010/wordprocessingGroup" xmlns:wpi="http://schemas.microsoft.com/office/word/2010/wordprocessingInk" xmlns:wne="http://schemas.microsoft.com/office/word/2006/wordml" xmlns:wps="http://schemas.microsoft.com/office/word/2010/wordprocessingShape" mc:Ignorable="w14 w15 w16se w16cid w16 w16cex w16sdtdh w16sdtfl cr w16du wp14">
-  <w16cex:commentExtensible w16cex:durableId="188638B0" w16cex:dateUtc="2026-04-09T03:28:00Z"/>
   <w16cex:commentExtensible w16cex:durableId="03D5254A" w16cex:dateUtc="2026-04-09T01:13:00Z"/>
-  <w16cex:commentExtensible w16cex:durableId="0003746E" w16cex:dateUtc="2026-04-09T00:35:00Z"/>
   <w16cex:commentExtensible w16cex:durableId="138198D8" w16cex:dateUtc="2026-04-09T02:39:00Z"/>
   <w16cex:commentExtensible w16cex:durableId="594AAA2B" w16cex:dateUtc="2026-04-09T00:35:00Z"/>
   <w16cex:commentExtensible w16cex:durableId="7813C1A3" w16cex:dateUtc="2026-04-09T02:40:00Z"/>
@@ -6412,6 +6089,7 @@
   <w16cex:commentExtensible w16cex:durableId="636C2EF3" w16cex:dateUtc="2026-04-09T17:14:00Z"/>
   <w16cex:commentExtensible w16cex:durableId="0393C337" w16cex:dateUtc="2026-04-09T18:12:00Z"/>
   <w16cex:commentExtensible w16cex:durableId="27916F95" w16cex:dateUtc="2026-04-09T04:14:00Z"/>
+  <w16cex:commentExtensible w16cex:durableId="71FE33F6" w16cex:dateUtc="2026-04-09T20:34:00Z"/>
   <w16cex:commentExtensible w16cex:durableId="5106CFC0" w16cex:dateUtc="2026-04-09T03:04:00Z"/>
   <w16cex:commentExtensible w16cex:durableId="7C511B06" w16cex:dateUtc="2026-04-09T03:05:00Z"/>
   <w16cex:commentExtensible w16cex:durableId="2C4CE2AF" w16cex:dateUtc="2026-04-09T17:23:00Z"/>
@@ -6424,7 +6102,6 @@
   <w16cex:commentExtensible w16cex:durableId="5210A8AF" w16cex:dateUtc="2026-04-09T16:52:00Z"/>
   <w16cex:commentExtensible w16cex:durableId="5CD64E61" w16cex:dateUtc="2026-04-09T17:12:00Z"/>
   <w16cex:commentExtensible w16cex:durableId="0DB43017" w16cex:dateUtc="2026-04-09T16:56:00Z"/>
-  <w16cex:commentExtensible w16cex:durableId="115ED4E6" w16cex:dateUtc="2026-04-09T15:25:00Z"/>
   <w16cex:commentExtensible w16cex:durableId="22A2C8CA" w16cex:dateUtc="2026-04-09T16:57:00Z"/>
   <w16cex:commentExtensible w16cex:durableId="0FF03AF6" w16cex:dateUtc="2026-04-09T16:58:00Z"/>
   <w16cex:commentExtensible w16cex:durableId="3D7CC637" w16cex:dateUtc="2026-04-09T17:13:00Z"/>
@@ -6440,15 +6117,12 @@
   <w16cex:commentExtensible w16cex:durableId="22F53BBD" w16cex:dateUtc="2026-04-09T18:34:00Z"/>
   <w16cex:commentExtensible w16cex:durableId="25454D6E" w16cex:dateUtc="2026-04-09T18:31:00Z"/>
   <w16cex:commentExtensible w16cex:durableId="08937769" w16cex:dateUtc="2025-09-22T22:03:00Z"/>
-  <w16cex:commentExtensible w16cex:durableId="2CE75F68" w16cex:dateUtc="2025-11-12T17:44:00Z"/>
 </w16cex:commentsExtensible>
 </file>
 
 <file path=word/commentsIds.xml><?xml version="1.0" encoding="utf-8"?>
 <w16cid:commentsIds xmlns:wpc="http://schemas.microsoft.com/office/word/2010/wordprocessingCanvas" xmlns:cx="http://schemas.microsoft.com/office/drawing/2014/chartex" xmlns:cx1="http://schemas.microsoft.com/office/drawing/2015/9/8/chartex" xmlns:cx2="http://schemas.microsoft.com/office/drawing/2015/10/21/chartex" xmlns:cx3="http://schemas.microsoft.com/office/drawing/2016/5/9/chartex" xmlns:cx4="http://schemas.microsoft.com/office/drawing/2016/5/10/chartex" xmlns:cx5="http://schemas.microsoft.com/office/drawing/2016/5/11/chartex" xmlns:cx6="http://schemas.microsoft.com/office/drawing/2016/5/12/chartex" xmlns:cx7="http://schemas.microsoft.com/office/drawing/2016/5/13/chartex" xmlns:cx8="http://schemas.microsoft.com/office/drawing/2016/5/14/chartex" xmlns:mc="http://schemas.openxmlformats.org/markup-compatibility/2006" xmlns:aink="http://schemas.microsoft.com/office/drawing/2016/ink" xmlns:am3d="http://schemas.microsoft.com/office/drawing/2017/model3d" xmlns:o="urn:schemas-microsoft-com:office:office" xmlns:oel="http://schemas.microsoft.com/office/2019/extlst" xmlns:r="http://schemas.openxmlformats.org/officeDocument/2006/relationships" xmlns:m="http://schemas.openxmlformats.org/officeDocument/2006/math" xmlns:v="urn:schemas-microsoft-com:vml" xmlns:wp14="http://schemas.microsoft.com/office/word/2010/wordprocessingDrawing" xmlns:wp="http://schemas.openxmlformats.org/drawingml/2006/wordprocessingDrawing" xmlns:w10="urn:schemas-microsoft-com:office:word" xmlns:w="http://schemas.openxmlformats.org/wordprocessingml/2006/main" xmlns:w14="http://schemas.microsoft.com/office/word/2010/wordml" xmlns:w15="http://schemas.microsoft.com/office/word/2012/wordml" xmlns:w16cex="http://schemas.microsoft.com/office/word/2018/wordml/cex" xmlns:w16cid="http://schemas.microsoft.com/office/word/2016/wordml/cid" xmlns:w16="http://schemas.microsoft.com/office/word/2018/wordml" xmlns:w16du="http://schemas.microsoft.com/office/word/2023/wordml/word16du" xmlns:w16sdtdh="http://schemas.microsoft.com/office/word/2020/wordml/sdtdatahash" xmlns:w16sdtfl="http://schemas.microsoft.com/office/word/2024/wordml/sdtformatlock" xmlns:w16se="http://schemas.microsoft.com/office/word/2015/wordml/symex" xmlns:wpg="http://schemas.microsoft.com/office/word/2010/wordprocessingGroup" xmlns:wpi="http://schemas.microsoft.com/office/word/2010/wordprocessingInk" xmlns:wne="http://schemas.microsoft.com/office/word/2006/wordml" xmlns:wps="http://schemas.microsoft.com/office/word/2010/wordprocessingShape" mc:Ignorable="w14 w15 w16se w16cid w16 w16cex w16sdtdh w16sdtfl w16du wp14">
-  <w16cid:commentId w16cid:paraId="6CB65538" w16cid:durableId="188638B0"/>
   <w16cid:commentId w16cid:paraId="7D26BAA3" w16cid:durableId="03D5254A"/>
-  <w16cid:commentId w16cid:paraId="04A16901" w16cid:durableId="0003746E"/>
   <w16cid:commentId w16cid:paraId="29537397" w16cid:durableId="138198D8"/>
   <w16cid:commentId w16cid:paraId="6DF72313" w16cid:durableId="594AAA2B"/>
   <w16cid:commentId w16cid:paraId="4FE3898E" w16cid:durableId="7813C1A3"/>
@@ -6468,6 +6142,7 @@
   <w16cid:commentId w16cid:paraId="04AD913C" w16cid:durableId="636C2EF3"/>
   <w16cid:commentId w16cid:paraId="388F7A41" w16cid:durableId="0393C337"/>
   <w16cid:commentId w16cid:paraId="2DEAB2B8" w16cid:durableId="27916F95"/>
+  <w16cid:commentId w16cid:paraId="33E1C747" w16cid:durableId="71FE33F6"/>
   <w16cid:commentId w16cid:paraId="5C5E9154" w16cid:durableId="5106CFC0"/>
   <w16cid:commentId w16cid:paraId="6BB1CEDA" w16cid:durableId="7C511B06"/>
   <w16cid:commentId w16cid:paraId="70EC2118" w16cid:durableId="2C4CE2AF"/>
@@ -6480,7 +6155,6 @@
   <w16cid:commentId w16cid:paraId="3155EECE" w16cid:durableId="5210A8AF"/>
   <w16cid:commentId w16cid:paraId="5AE17C7A" w16cid:durableId="5CD64E61"/>
   <w16cid:commentId w16cid:paraId="45F76044" w16cid:durableId="0DB43017"/>
-  <w16cid:commentId w16cid:paraId="1FEA7C0B" w16cid:durableId="115ED4E6"/>
   <w16cid:commentId w16cid:paraId="574923F3" w16cid:durableId="22A2C8CA"/>
   <w16cid:commentId w16cid:paraId="44AE4710" w16cid:durableId="0FF03AF6"/>
   <w16cid:commentId w16cid:paraId="17147733" w16cid:durableId="3D7CC637"/>
@@ -6496,7 +6170,6 @@
   <w16cid:commentId w16cid:paraId="0EA73272" w16cid:durableId="22F53BBD"/>
   <w16cid:commentId w16cid:paraId="3CED7C0A" w16cid:durableId="25454D6E"/>
   <w16cid:commentId w16cid:paraId="56896536" w16cid:durableId="08937769"/>
-  <w16cid:commentId w16cid:paraId="15626216" w16cid:durableId="2CE75F68"/>
 </w16cid:commentsIds>
 </file>
 

</xml_diff>

<commit_message>
Optimize MI categorical summary and stabilize full render
</commit_message>
<xml_diff>
--- a/Drafts/04-08-25 ABG_VBG_Rough Draft BL.docx
+++ b/Drafts/04-08-25 ABG_VBG_Rough Draft BL.docx
@@ -197,10 +197,7 @@
     </w:p>
     <w:p>
       <w:r>
-        <w:t xml:space="preserve">National Center for Advancing Translational Sciences UL1TR002538 and UM1TR004409 </w:t>
-      </w:r>
-      <w:r>
-        <w:t>(R.G.)</w:t>
+        <w:t>National Center for Advancing Translational Sciences UL1TR002538 and UM1TR004409 (R.G.)</w:t>
       </w:r>
     </w:p>
     <w:p>
@@ -315,31 +312,7 @@
             <w:u w:val="none"/>
             <w:shd w:val="clear" w:color="auto" w:fill="FFFFFF"/>
           </w:rPr>
-          <w:t>https:/</w:t>
-        </w:r>
-        <w:r>
-          <w:rPr>
-            <w:rStyle w:val="Hyperlink"/>
-            <w:u w:val="none"/>
-            <w:shd w:val="clear" w:color="auto" w:fill="FFFFFF"/>
-          </w:rPr>
-          <w:t>/</w:t>
-        </w:r>
-        <w:r>
-          <w:rPr>
-            <w:rStyle w:val="Hyperlink"/>
-            <w:u w:val="none"/>
-            <w:shd w:val="clear" w:color="auto" w:fill="FFFFFF"/>
-          </w:rPr>
-          <w:t>g</w:t>
-        </w:r>
-        <w:r>
-          <w:rPr>
-            <w:rStyle w:val="Hyperlink"/>
-            <w:u w:val="none"/>
-            <w:shd w:val="clear" w:color="auto" w:fill="FFFFFF"/>
-          </w:rPr>
-          <w:t>ithub.com/reblocke/abg-vbg-project</w:t>
+          <w:t>https://github.com/reblocke/abg-vbg-project</w:t>
         </w:r>
       </w:hyperlink>
       <w:r>
@@ -639,10 +612,7 @@
         <w:t xml:space="preserve"> use is substantial but incomplete. Prior investigations have primarily examined </w:t>
       </w:r>
       <w:r>
-        <w:t>a</w:t>
-      </w:r>
-      <w:r>
-        <w:t xml:space="preserve">nalytic </w:t>
+        <w:t xml:space="preserve">analytic </w:t>
       </w:r>
       <w:commentRangeStart w:id="8"/>
       <w:commentRangeStart w:id="9"/>
@@ -803,13 +773,7 @@
         </w:rPr>
       </w:pPr>
       <w:r>
-        <w:t xml:space="preserve">We therefore evaluated whether venous and arterial pCO₂ </w:t>
-      </w:r>
-      <w:r>
-        <w:t>showed similar prognostic associations with</w:t>
-      </w:r>
-      <w:r>
-        <w:t xml:space="preserve"> subsequent diagnosis of hypercapnic respiratory failure, ventilatory support, and 60-day mortality in a multicenter retrospective cohort of adults with presentations suggesting possible hypercapnia. We hypothesized that, after inverse propensity-of-sampling weighting to account for differential test ordering </w:t>
+        <w:t xml:space="preserve">We therefore evaluated whether venous and arterial pCO₂ showed similar prognostic associations with subsequent diagnosis of hypercapnic respiratory failure, ventilatory support, and 60-day mortality in a multicenter retrospective cohort of adults with presentations suggesting possible hypercapnia. We hypothesized that, after inverse propensity-of-sampling weighting to account for differential test ordering </w:t>
       </w:r>
       <w:r>
         <w:t>patterns</w:t>
@@ -981,22 +945,13 @@
         <w:t>.</w:t>
       </w:r>
       <w:r>
-        <w:t xml:space="preserve"> </w:t>
-      </w:r>
-      <w:r>
-        <w:t xml:space="preserve">Eligible encounters met at least one of the following criteria on the index encounter: (1) arterial or venous blood gas testing on the first hospital day; </w:t>
+        <w:t xml:space="preserve"> Eligible encounters met at least one of the following criteria on the index encounter: (1) arterial or venous blood gas testing on the first hospital day; </w:t>
       </w:r>
       <w:r>
         <w:t>(2) diagnostic codes for respiratory failure; (3) diagnostic codes for conditions associated with hypercapnia, including COPD, neuromuscular disease, or severe obesity</w:t>
       </w:r>
       <w:r>
-        <w:t>; or (</w:t>
-      </w:r>
-      <w:r>
-        <w:t>4</w:t>
-      </w:r>
-      <w:r>
-        <w:t>) procedure codes for invasive or non-invasive ventilatory support (</w:t>
+        <w:t>; or (4) procedure codes for invasive or non-invasive ventilatory support (</w:t>
       </w:r>
       <w:r>
         <w:t>Supplementary table 1</w:t>
@@ -1007,10 +962,7 @@
       <w:commentRangeStart w:id="19"/>
       <w:commentRangeStart w:id="20"/>
       <w:r>
-        <w:t>.</w:t>
-      </w:r>
-      <w:r>
-        <w:t xml:space="preserve"> Patients could contribute multiple eligible encounters. </w:t>
+        <w:t xml:space="preserve">. Patients could contribute multiple eligible encounters. </w:t>
       </w:r>
       <w:r>
         <w:rPr>
@@ -1587,13 +1539,6 @@
           <w:rStyle w:val="CommentReference"/>
           <w:sz w:val="24"/>
           <w:szCs w:val="24"/>
-          <w:rPrChange w:id="38" w:author="Brian Locke" w:date="2026-04-08T21:47:00Z">
-            <w:rPr>
-              <w:rStyle w:val="CommentReference"/>
-              <w:sz w:val="24"/>
-              <w:szCs w:val="24"/>
-            </w:rPr>
-          </w:rPrChange>
         </w:rPr>
         <w:commentReference w:id="37"/>
       </w:r>
@@ -1628,18 +1573,18 @@
       <w:pPr>
         <w:pStyle w:val="Title"/>
       </w:pPr>
-      <w:commentRangeStart w:id="39"/>
+      <w:commentRangeStart w:id="38"/>
       <w:r>
         <w:t>Results:</w:t>
       </w:r>
-      <w:commentRangeEnd w:id="39"/>
+      <w:commentRangeEnd w:id="38"/>
       <w:r>
         <w:rPr>
           <w:rStyle w:val="CommentReference"/>
           <w:sz w:val="24"/>
           <w:szCs w:val="22"/>
         </w:rPr>
-        <w:commentReference w:id="39"/>
+        <w:commentReference w:id="38"/>
       </w:r>
     </w:p>
     <w:p>
@@ -1649,18 +1594,18 @@
       <w:r>
         <w:t>Cohort assembly and analytic s</w:t>
       </w:r>
-      <w:commentRangeStart w:id="40"/>
+      <w:commentRangeStart w:id="39"/>
       <w:r>
         <w:t>ample</w:t>
       </w:r>
-      <w:commentRangeEnd w:id="40"/>
+      <w:commentRangeEnd w:id="39"/>
       <w:r>
         <w:rPr>
           <w:rStyle w:val="CommentReference"/>
           <w:sz w:val="24"/>
           <w:szCs w:val="22"/>
         </w:rPr>
-        <w:commentReference w:id="40"/>
+        <w:commentReference w:id="39"/>
       </w:r>
     </w:p>
     <w:p>
@@ -1678,18 +1623,18 @@
       <w:r>
         <w:t xml:space="preserve">Baseline characteristics </w:t>
       </w:r>
-      <w:commentRangeStart w:id="41"/>
+      <w:commentRangeStart w:id="40"/>
       <w:r>
         <w:t>and test-ordering differences</w:t>
       </w:r>
-      <w:commentRangeEnd w:id="41"/>
+      <w:commentRangeEnd w:id="40"/>
       <w:r>
         <w:rPr>
           <w:rStyle w:val="CommentReference"/>
           <w:sz w:val="24"/>
           <w:szCs w:val="22"/>
         </w:rPr>
-        <w:commentReference w:id="41"/>
+        <w:commentReference w:id="40"/>
       </w:r>
     </w:p>
     <w:p>
@@ -1710,18 +1655,18 @@
       <w:pPr>
         <w:pStyle w:val="Subtitle"/>
       </w:pPr>
-      <w:commentRangeStart w:id="42"/>
+      <w:commentRangeStart w:id="41"/>
       <w:r>
         <w:t>Primary weighted analyses</w:t>
       </w:r>
-      <w:commentRangeEnd w:id="42"/>
+      <w:commentRangeEnd w:id="41"/>
       <w:r>
         <w:rPr>
           <w:rStyle w:val="CommentReference"/>
           <w:sz w:val="24"/>
           <w:szCs w:val="22"/>
         </w:rPr>
-        <w:commentReference w:id="42"/>
+        <w:commentReference w:id="41"/>
       </w:r>
     </w:p>
     <w:p>
@@ -1764,18 +1709,18 @@
       <w:pPr>
         <w:pStyle w:val="Subtitle"/>
       </w:pPr>
-      <w:commentRangeStart w:id="43"/>
+      <w:commentRangeStart w:id="42"/>
       <w:r>
         <w:t>Secondary analyses</w:t>
       </w:r>
-      <w:commentRangeEnd w:id="43"/>
+      <w:commentRangeEnd w:id="42"/>
       <w:r>
         <w:rPr>
           <w:rStyle w:val="CommentReference"/>
           <w:sz w:val="24"/>
           <w:szCs w:val="22"/>
         </w:rPr>
-        <w:commentReference w:id="43"/>
+        <w:commentReference w:id="42"/>
       </w:r>
     </w:p>
     <w:p>
@@ -1790,18 +1735,18 @@
       <w:r>
         <w:t xml:space="preserve">Sensitivity analyses and </w:t>
       </w:r>
-      <w:commentRangeStart w:id="44"/>
+      <w:commentRangeStart w:id="43"/>
       <w:r>
         <w:t>diagnostics</w:t>
       </w:r>
-      <w:commentRangeEnd w:id="44"/>
+      <w:commentRangeEnd w:id="43"/>
       <w:r>
         <w:rPr>
           <w:rStyle w:val="CommentReference"/>
           <w:sz w:val="24"/>
           <w:szCs w:val="22"/>
         </w:rPr>
-        <w:commentReference w:id="44"/>
+        <w:commentReference w:id="43"/>
       </w:r>
     </w:p>
     <w:p>
@@ -1839,47 +1784,47 @@
       <w:r>
         <w:t>Earlier work on ABG and VBG comparison has largely asked a narrower question than the one addressed here. Most studies evaluated analytic agreement, venous screening thresholds for arterial hypercapnia, or formulas intended to estimate arterial values from venous s</w:t>
       </w:r>
-      <w:commentRangeStart w:id="45"/>
+      <w:commentRangeStart w:id="44"/>
       <w:r>
         <w:t>amples</w:t>
       </w:r>
-      <w:commentRangeEnd w:id="45"/>
+      <w:commentRangeEnd w:id="44"/>
       <w:r>
         <w:rPr>
           <w:rStyle w:val="CommentReference"/>
           <w:sz w:val="24"/>
           <w:szCs w:val="24"/>
         </w:rPr>
-        <w:commentReference w:id="45"/>
+        <w:commentReference w:id="44"/>
       </w:r>
       <w:r>
         <w:t xml:space="preserve">; a 2024 systematic review concluded that the clinical impacts of choosing ABG vs VBG remained largely </w:t>
       </w:r>
-      <w:commentRangeStart w:id="46"/>
+      <w:commentRangeStart w:id="45"/>
       <w:r>
         <w:t xml:space="preserve">unknown. </w:t>
       </w:r>
-      <w:commentRangeEnd w:id="46"/>
+      <w:commentRangeEnd w:id="45"/>
       <w:r>
         <w:rPr>
           <w:rStyle w:val="CommentReference"/>
           <w:sz w:val="24"/>
           <w:szCs w:val="24"/>
         </w:rPr>
-        <w:commentReference w:id="46"/>
-      </w:r>
-      <w:commentRangeStart w:id="47"/>
+        <w:commentReference w:id="45"/>
+      </w:r>
+      <w:commentRangeStart w:id="46"/>
       <w:r>
         <w:t>Körver et al.</w:t>
       </w:r>
-      <w:commentRangeEnd w:id="47"/>
+      <w:commentRangeEnd w:id="46"/>
       <w:r>
         <w:rPr>
           <w:rStyle w:val="CommentReference"/>
           <w:sz w:val="24"/>
           <w:szCs w:val="24"/>
         </w:rPr>
-        <w:commentReference w:id="47"/>
+        <w:commentReference w:id="46"/>
       </w:r>
       <w:r>
         <w:t xml:space="preserve"> then examined whether venous testing plus pulse oximetry could replace ABG for treatment and disposition decisions in the ED, but even that design did not assess whether arterial and venous pCO₂ show similar associations with later clinically important outcomes. </w:t>
@@ -1948,19 +1893,19 @@
       <w:pPr>
         <w:pStyle w:val="Title"/>
       </w:pPr>
-      <w:commentRangeStart w:id="48"/>
+      <w:commentRangeStart w:id="47"/>
       <w:r>
         <w:lastRenderedPageBreak/>
         <w:t xml:space="preserve">References: </w:t>
       </w:r>
-      <w:commentRangeEnd w:id="48"/>
+      <w:commentRangeEnd w:id="47"/>
       <w:r>
         <w:rPr>
           <w:rStyle w:val="CommentReference"/>
           <w:sz w:val="24"/>
           <w:szCs w:val="22"/>
         </w:rPr>
-        <w:commentReference w:id="48"/>
+        <w:commentReference w:id="47"/>
       </w:r>
     </w:p>
     <w:p>
@@ -2155,13 +2100,12 @@
       <w:r>
         <w:rPr>
           <w:noProof/>
-          <w14:ligatures w14:val="standardContextual"/>
         </w:rPr>
         <w:drawing>
-          <wp:inline distT="0" distB="0" distL="0" distR="0" wp14:anchorId="54AB2CBA" wp14:editId="518B036D">
-            <wp:extent cx="5943600" cy="4953000"/>
-            <wp:effectExtent l="0" t="0" r="0" b="0"/>
-            <wp:docPr id="802862280" name="Picture 1"/>
+          <wp:inline distT="0" distB="0" distL="0" distR="0" wp14:anchorId="0C007760" wp14:editId="49C5344F">
+            <wp:extent cx="5943600" cy="4591685"/>
+            <wp:effectExtent l="0" t="0" r="0" b="5715"/>
+            <wp:docPr id="2106732616" name="Picture 1" descr="Figure 1 page 14"/>
             <wp:cNvGraphicFramePr>
               <a:graphicFrameLocks xmlns:a="http://schemas.openxmlformats.org/drawingml/2006/main" noChangeAspect="1"/>
             </wp:cNvGraphicFramePr>
@@ -2169,8 +2113,10 @@
               <a:graphicData uri="http://schemas.openxmlformats.org/drawingml/2006/picture">
                 <pic:pic xmlns:pic="http://schemas.openxmlformats.org/drawingml/2006/picture">
                   <pic:nvPicPr>
-                    <pic:cNvPr id="802862280" name="Picture 802862280"/>
-                    <pic:cNvPicPr/>
+                    <pic:cNvPr id="0" name="Picture 1" descr="Figure 1 page 14"/>
+                    <pic:cNvPicPr>
+                      <a:picLocks noChangeAspect="1" noChangeArrowheads="1"/>
+                    </pic:cNvPicPr>
                   </pic:nvPicPr>
                   <pic:blipFill>
                     <a:blip r:embed="rId11" cstate="print">
@@ -2180,18 +2126,23 @@
                         </a:ext>
                       </a:extLst>
                     </a:blip>
+                    <a:srcRect/>
                     <a:stretch>
                       <a:fillRect/>
                     </a:stretch>
                   </pic:blipFill>
-                  <pic:spPr>
+                  <pic:spPr bwMode="auto">
                     <a:xfrm>
                       <a:off x="0" y="0"/>
-                      <a:ext cx="5943600" cy="4953000"/>
+                      <a:ext cx="5943600" cy="4591685"/>
                     </a:xfrm>
                     <a:prstGeom prst="rect">
                       <a:avLst/>
                     </a:prstGeom>
+                    <a:noFill/>
+                    <a:ln>
+                      <a:noFill/>
+                    </a:ln>
                   </pic:spPr>
                 </pic:pic>
               </a:graphicData>
@@ -2788,13 +2739,7 @@
     <w:p/>
     <w:p>
       <w:r>
-        <w:t xml:space="preserve">Figure S4: </w:t>
-      </w:r>
-      <w:r>
-        <w:t>Supplementary Figure S4</w:t>
-      </w:r>
-      <w:r>
-        <w:t xml:space="preserve"> – categorical representation of the main results figure. </w:t>
+        <w:t xml:space="preserve">Figure S4: Supplementary Figure S4 – categorical representation of the main results figure. </w:t>
       </w:r>
     </w:p>
     <w:p>
@@ -2890,8 +2835,6 @@
       </w:r>
       <w:r>
         <w:br/>
-      </w:r>
-      <w:r>
         <w:t>Love plot or balance plot showing absolute standardized mean differences before and after GBM weighting, separately for ABG and VBG.</w:t>
       </w:r>
     </w:p>
@@ -5572,7 +5515,7 @@
         </w:rPr>
         <w:annotationRef/>
       </w:r>
-      <w:hyperlink r:id="rId20" w:history="1">
+      <w:hyperlink r:id="rId20" w:anchor="citation" w:history="1">
         <w:r>
           <w:rPr>
             <w:rStyle w:val="Hyperlink"/>
@@ -5604,7 +5547,7 @@
       </w:hyperlink>
     </w:p>
   </w:comment>
-  <w:comment w:id="39" w:author="Brian Locke" w:date="2026-04-09T09:27:00Z" w:initials="BL">
+  <w:comment w:id="38" w:author="Brian Locke" w:date="2026-04-09T09:27:00Z" w:initials="BL">
     <w:p>
       <w:r>
         <w:rPr>
@@ -5621,7 +5564,7 @@
       </w:r>
     </w:p>
   </w:comment>
-  <w:comment w:id="40" w:author="Brian Locke" w:date="2026-04-09T06:40:00Z" w:initials="BL">
+  <w:comment w:id="39" w:author="Brian Locke" w:date="2026-04-09T06:40:00Z" w:initials="BL">
     <w:p>
       <w:r>
         <w:rPr>
@@ -5701,7 +5644,7 @@
       </w:r>
     </w:p>
   </w:comment>
-  <w:comment w:id="41" w:author="Brian Locke" w:date="2026-04-09T06:41:00Z" w:initials="BL">
+  <w:comment w:id="40" w:author="Brian Locke" w:date="2026-04-09T06:41:00Z" w:initials="BL">
     <w:p>
       <w:r>
         <w:rPr>
@@ -5763,7 +5706,7 @@
       </w:r>
     </w:p>
   </w:comment>
-  <w:comment w:id="42" w:author="Brian Locke" w:date="2026-04-09T06:43:00Z" w:initials="BL">
+  <w:comment w:id="41" w:author="Brian Locke" w:date="2026-04-09T06:43:00Z" w:initials="BL">
     <w:p>
       <w:r>
         <w:rPr>
@@ -5826,7 +5769,7 @@
     </w:p>
     <w:p/>
   </w:comment>
-  <w:comment w:id="43" w:author="Brian Locke" w:date="2026-04-09T06:56:00Z" w:initials="BL">
+  <w:comment w:id="42" w:author="Brian Locke" w:date="2026-04-09T06:56:00Z" w:initials="BL">
     <w:p>
       <w:r>
         <w:rPr>
@@ -5855,7 +5798,7 @@
     </w:p>
     <w:p/>
   </w:comment>
-  <w:comment w:id="44" w:author="Brian Locke" w:date="2026-04-09T06:57:00Z" w:initials="BL">
+  <w:comment w:id="43" w:author="Brian Locke" w:date="2026-04-09T06:57:00Z" w:initials="BL">
     <w:p>
       <w:r>
         <w:rPr>
@@ -5894,7 +5837,7 @@
     </w:p>
     <w:p/>
   </w:comment>
-  <w:comment w:id="45" w:author="Brian Locke" w:date="2026-04-09T12:35:00Z" w:initials="BL">
+  <w:comment w:id="44" w:author="Brian Locke" w:date="2026-04-09T12:35:00Z" w:initials="BL">
     <w:p>
       <w:r>
         <w:rPr>
@@ -5921,7 +5864,7 @@
       </w:hyperlink>
     </w:p>
   </w:comment>
-  <w:comment w:id="46" w:author="Brian Locke" w:date="2026-04-09T12:34:00Z" w:initials="BL">
+  <w:comment w:id="45" w:author="Brian Locke" w:date="2026-04-09T12:34:00Z" w:initials="BL">
     <w:p>
       <w:r>
         <w:rPr>
@@ -5948,7 +5891,7 @@
       </w:hyperlink>
     </w:p>
   </w:comment>
-  <w:comment w:id="47" w:author="Brian Locke" w:date="2026-04-09T12:31:00Z" w:initials="BL">
+  <w:comment w:id="46" w:author="Brian Locke" w:date="2026-04-09T12:31:00Z" w:initials="BL">
     <w:p>
       <w:r>
         <w:rPr>
@@ -5968,7 +5911,7 @@
       </w:hyperlink>
     </w:p>
   </w:comment>
-  <w:comment w:id="48" w:author="Brian Locke" w:date="2025-09-22T16:03:00Z" w:initials="BL">
+  <w:comment w:id="47" w:author="Brian Locke" w:date="2025-09-22T16:03:00Z" w:initials="BL">
     <w:p>
       <w:r>
         <w:rPr>
@@ -8750,6 +8693,7 @@
   <w:style w:type="character" w:default="1" w:styleId="DefaultParagraphFont">
     <w:name w:val="Default Paragraph Font"/>
     <w:uiPriority w:val="1"/>
+    <w:semiHidden/>
     <w:unhideWhenUsed/>
   </w:style>
   <w:style w:type="table" w:default="1" w:styleId="TableNormal">

</xml_diff>